<commit_message>
fix(f-dbtool-2): land table-body fix (constitution 0fcc00b) + close HXC-128 (31 descriptions backfilled)
Constitution -> 0fcc00b (F-DBTOOL-2: update --description no longer corrupts table-rep bodies + regression
test). Applied the copy-validated 31 human-readable descriptions to the SSoT + closed HXC-128; export
regenerated all trackers (diff: in-sync, validate OK 324, 0 sub-50-char descriptions remain).
Queue now 6 Queued (HXC-117/118/119 Phase-2 landed-not-fully-visible; HXC-122 infra; HXC-124 token-field;
HXC-126 move-drift — a separate location-normalization, still deferred).

Co-Authored-By: Claude Opus 4.8 <noreply@anthropic.com>
</commit_message>
<xml_diff>
--- a/docs/Fixed.docx
+++ b/docs/Fixed.docx
@@ -2,7 +2,7 @@
 <file path=word/document.xml><?xml version="1.0" encoding="utf-8"?>
 <w:document xmlns:w="http://schemas.openxmlformats.org/wordprocessingml/2006/main" xmlns:m="http://schemas.openxmlformats.org/officeDocument/2006/math" xmlns:r="http://schemas.openxmlformats.org/officeDocument/2006/relationships" xmlns:o="urn:schemas-microsoft-com:office:office" xmlns:v="urn:schemas-microsoft-com:vml" xmlns:w10="urn:schemas-microsoft-com:office:word" xmlns:a="http://schemas.openxmlformats.org/drawingml/2006/main" xmlns:pic="http://schemas.openxmlformats.org/drawingml/2006/picture" xmlns:wp="http://schemas.openxmlformats.org/drawingml/2006/wordprocessingDrawing">
   <w:body>
-    <w:bookmarkStart w:id="99" w:name="helixcode-fixed-items-tracker"/>
+    <w:bookmarkStart w:id="100" w:name="helixcode-fixed-items-tracker"/>
     <w:p>
       <w:pPr>
         <w:pStyle w:val="Heading1"/>
@@ -23903,29 +23903,13 @@
           <w:b/>
           <w:bCs/>
         </w:rPr>
-        <w:t xml:space="preserve">Evidence:</w:t>
-      </w:r>
-      <w:r>
-        <w:t xml:space="preserve"> </w:t>
-      </w:r>
-      <w:r>
-        <w:t xml:space="preserve">commit:61d7167e autocommit git substrate</w:t>
-      </w:r>
-      <w:r>
-        <w:t xml:space="preserve"> </w:t>
-      </w:r>
-      <w:r>
-        <w:rPr>
-          <w:b/>
-          <w:bCs/>
-        </w:rPr>
         <w:t xml:space="preserve">Severity:</w:t>
       </w:r>
       <w:r>
         <w:t xml:space="preserve"> </w:t>
       </w:r>
       <w:r>
-        <w:t xml:space="preserve">High</w:t>
+        <w:t xml:space="preserve">Medium</w:t>
       </w:r>
       <w:r>
         <w:t xml:space="preserve"> </w:t>
@@ -23965,7 +23949,7 @@
         <w:pStyle w:val="BodyText"/>
       </w:pPr>
       <w:r>
-        <w:t xml:space="preserve">Add an autocommit git substrate that snapshots edits so /undo and /diff operate on real commits rather than in-memory state (commit 61d7167e).</w:t>
+        <w:t xml:space="preserve">The CLI keeps an automatic git-backed history of every edit it makes so users can review and safely roll back changes; this item established that autocommit substrate underneath the edit history.</w:t>
       </w:r>
     </w:p>
     <w:bookmarkEnd w:id="46"/>
@@ -30100,7 +30084,107 @@
       </w:r>
     </w:p>
     <w:bookmarkEnd w:id="98"/>
+    <w:bookmarkStart w:id="99" w:name="Xf46242d8049bad562265200b64c71f230dad0d3"/>
+    <w:p>
+      <w:pPr>
+        <w:pStyle w:val="Heading2"/>
+      </w:pPr>
+      <w:r>
+        <w:t xml:space="preserve">HXC-128 — Thirty-six work items have descriptions too short to be understandable</w:t>
+      </w:r>
+    </w:p>
+    <w:p>
+      <w:pPr>
+        <w:pStyle w:val="FirstParagraph"/>
+      </w:pPr>
+      <w:r>
+        <w:rPr>
+          <w:b/>
+          <w:bCs/>
+        </w:rPr>
+        <w:t xml:space="preserve">Status:</w:t>
+      </w:r>
+      <w:r>
+        <w:t xml:space="preserve"> </w:t>
+      </w:r>
+      <w:r>
+        <w:t xml:space="preserve">Completed (→ Fixed.md)</w:t>
+      </w:r>
+      <w:r>
+        <w:t xml:space="preserve"> </w:t>
+      </w:r>
+      <w:r>
+        <w:rPr>
+          <w:b/>
+          <w:bCs/>
+        </w:rPr>
+        <w:t xml:space="preserve">Type:</w:t>
+      </w:r>
+      <w:r>
+        <w:t xml:space="preserve"> </w:t>
+      </w:r>
+      <w:r>
+        <w:t xml:space="preserve">Task</w:t>
+      </w:r>
+      <w:r>
+        <w:t xml:space="preserve"> </w:t>
+      </w:r>
+      <w:r>
+        <w:rPr>
+          <w:b/>
+          <w:bCs/>
+        </w:rPr>
+        <w:t xml:space="preserve">Evidence:</w:t>
+      </w:r>
+      <w:r>
+        <w:t xml:space="preserve"> </w:t>
+      </w:r>
+      <w:r>
+        <w:t xml:space="preserve">docs/qa/fdbtool_hygiene_20260712T071056Z/W2C_hygiene_proposals.jsonl</w:t>
+      </w:r>
+      <w:r>
+        <w:t xml:space="preserve"> </w:t>
+      </w:r>
+      <w:r>
+        <w:rPr>
+          <w:b/>
+          <w:bCs/>
+        </w:rPr>
+        <w:t xml:space="preserve">Severity:</w:t>
+      </w:r>
+      <w:r>
+        <w:t xml:space="preserve"> </w:t>
+      </w:r>
+      <w:r>
+        <w:t xml:space="preserve">Low</w:t>
+      </w:r>
+      <w:r>
+        <w:t xml:space="preserve"> </w:t>
+      </w:r>
+      <w:r>
+        <w:rPr>
+          <w:b/>
+          <w:bCs/>
+        </w:rPr>
+        <w:t xml:space="preserve">Created-By:</w:t>
+      </w:r>
+      <w:r>
+        <w:t xml:space="preserve"> </w:t>
+      </w:r>
+      <w:r>
+        <w:t xml:space="preserve">Claude</w:t>
+      </w:r>
+    </w:p>
+    <w:p>
+      <w:pPr>
+        <w:pStyle w:val="BodyText"/>
+      </w:pPr>
+      <w:r>
+        <w:t xml:space="preserve">Thirty-six tracked items have descriptions shorter than the minimum length needed to convey what they are about, so a reader cannot understand them without reading code. The work rewrites these into clear plain-language descriptions explaining what each item is and why it matters. Every item then becomes understandable to non-developers and stakeholders.</w:t>
+      </w:r>
+    </w:p>
     <w:bookmarkEnd w:id="99"/>
+    <w:bookmarkEnd w:id="100"/>
     <w:sectPr>
       <w:footnotePr>
         <w:numRestart w:val="eachSect"/>

</xml_diff>

<commit_message>
close(followups): HXC-133 + HXC-124 fixed, HXC-131 obsolete (dup of b058c7c2)
HXC-133 hermetic Azure factory test; HXC-124 HelixQA token-field consumer runner; HXC-131 not-reproducible
(already fixed by b058c7c2) -> Obsolete duplicate-of. diff in-sync, validate OK.

Co-Authored-By: Claude Opus 4.8 <noreply@anthropic.com>
</commit_message>
<xml_diff>
--- a/docs/Fixed.docx
+++ b/docs/Fixed.docx
@@ -2,7 +2,7 @@
 <file path=word/document.xml><?xml version="1.0" encoding="utf-8"?>
 <w:document xmlns:w="http://schemas.openxmlformats.org/wordprocessingml/2006/main" xmlns:m="http://schemas.openxmlformats.org/officeDocument/2006/math" xmlns:r="http://schemas.openxmlformats.org/officeDocument/2006/relationships" xmlns:o="urn:schemas-microsoft-com:office:office" xmlns:v="urn:schemas-microsoft-com:vml" xmlns:w10="urn:schemas-microsoft-com:office:word" xmlns:a="http://schemas.openxmlformats.org/drawingml/2006/main" xmlns:pic="http://schemas.openxmlformats.org/drawingml/2006/picture" xmlns:wp="http://schemas.openxmlformats.org/drawingml/2006/wordprocessingDrawing">
   <w:body>
-    <w:bookmarkStart w:id="100" w:name="helixcode-fixed-items-tracker"/>
+    <w:bookmarkStart w:id="103" w:name="helixcode-fixed-items-tracker"/>
     <w:p>
       <w:pPr>
         <w:pStyle w:val="Heading1"/>
@@ -30184,7 +30184,323 @@
       </w:r>
     </w:p>
     <w:bookmarkEnd w:id="99"/>
+    <w:bookmarkStart w:id="100" w:name="Xc4850058affb934a790611aa86e80698fb7a9d4"/>
+    <w:p>
+      <w:pPr>
+        <w:pStyle w:val="Heading2"/>
+      </w:pPr>
+      <w:r>
+        <w:t xml:space="preserve">HXC-133 — Azure provider factory test assumes an ambient endpoint environment variable</w:t>
+      </w:r>
+    </w:p>
+    <w:p>
+      <w:pPr>
+        <w:pStyle w:val="FirstParagraph"/>
+      </w:pPr>
+      <w:r>
+        <w:rPr>
+          <w:b/>
+          <w:bCs/>
+        </w:rPr>
+        <w:t xml:space="preserve">Status:</w:t>
+      </w:r>
+      <w:r>
+        <w:t xml:space="preserve"> </w:t>
+      </w:r>
+      <w:r>
+        <w:t xml:space="preserve">Fixed (→ Fixed.md)</w:t>
+      </w:r>
+      <w:r>
+        <w:t xml:space="preserve"> </w:t>
+      </w:r>
+      <w:r>
+        <w:rPr>
+          <w:b/>
+          <w:bCs/>
+        </w:rPr>
+        <w:t xml:space="preserve">Type:</w:t>
+      </w:r>
+      <w:r>
+        <w:t xml:space="preserve"> </w:t>
+      </w:r>
+      <w:r>
+        <w:t xml:space="preserve">Bug</w:t>
+      </w:r>
+      <w:r>
+        <w:t xml:space="preserve"> </w:t>
+      </w:r>
+      <w:r>
+        <w:rPr>
+          <w:b/>
+          <w:bCs/>
+        </w:rPr>
+        <w:t xml:space="preserve">Evidence:</w:t>
+      </w:r>
+      <w:r>
+        <w:t xml:space="preserve"> </w:t>
+      </w:r>
+      <w:r>
+        <w:t xml:space="preserve">docs/qa/followup_fixes_20260712T085616Z/HXC133_evidence.md</w:t>
+      </w:r>
+      <w:r>
+        <w:t xml:space="preserve"> </w:t>
+      </w:r>
+      <w:r>
+        <w:rPr>
+          <w:b/>
+          <w:bCs/>
+        </w:rPr>
+        <w:t xml:space="preserve">Severity:</w:t>
+      </w:r>
+      <w:r>
+        <w:t xml:space="preserve"> </w:t>
+      </w:r>
+      <w:r>
+        <w:t xml:space="preserve">Low</w:t>
+      </w:r>
+      <w:r>
+        <w:t xml:space="preserve"> </w:t>
+      </w:r>
+      <w:r>
+        <w:rPr>
+          <w:b/>
+          <w:bCs/>
+        </w:rPr>
+        <w:t xml:space="preserve">Created-By:</w:t>
+      </w:r>
+      <w:r>
+        <w:t xml:space="preserve"> </w:t>
+      </w:r>
+      <w:r>
+        <w:t xml:space="preserve">Claude</w:t>
+      </w:r>
+    </w:p>
+    <w:p>
+      <w:pPr>
+        <w:pStyle w:val="BodyText"/>
+      </w:pPr>
+      <w:r>
+        <w:t xml:space="preserve">One Azure-provider test quietly depends on an endpoint value being present in the environment; when that value is injected by the full-test setup the test’s assumptions no longer hold. It does not crash, but it is fragile and can give misleading results depending on the environment. The work is to make the test hermetic (control its own environment) like the sibling test already fixed. This makes the Azure test suite reliable regardless of how it is run.</w:t>
+      </w:r>
+    </w:p>
     <w:bookmarkEnd w:id="100"/>
+    <w:bookmarkStart w:id="101" w:name="X701901c238f6d2d938cd9c0890120413c4ea9e7"/>
+    <w:p>
+      <w:pPr>
+        <w:pStyle w:val="Heading2"/>
+      </w:pPr>
+      <w:r>
+        <w:t xml:space="preserve">HXC-124 — HelixQA task-workflow bank cannot fully self-run due to a JWT token-minting gap</w:t>
+      </w:r>
+    </w:p>
+    <w:p>
+      <w:pPr>
+        <w:pStyle w:val="FirstParagraph"/>
+      </w:pPr>
+      <w:r>
+        <w:rPr>
+          <w:b/>
+          <w:bCs/>
+        </w:rPr>
+        <w:t xml:space="preserve">Status:</w:t>
+      </w:r>
+      <w:r>
+        <w:t xml:space="preserve"> </w:t>
+      </w:r>
+      <w:r>
+        <w:t xml:space="preserve">Fixed (→ Fixed.md)</w:t>
+      </w:r>
+      <w:r>
+        <w:t xml:space="preserve"> </w:t>
+      </w:r>
+      <w:r>
+        <w:rPr>
+          <w:b/>
+          <w:bCs/>
+        </w:rPr>
+        <w:t xml:space="preserve">Type:</w:t>
+      </w:r>
+      <w:r>
+        <w:t xml:space="preserve"> </w:t>
+      </w:r>
+      <w:r>
+        <w:t xml:space="preserve">Bug</w:t>
+      </w:r>
+      <w:r>
+        <w:t xml:space="preserve"> </w:t>
+      </w:r>
+      <w:r>
+        <w:rPr>
+          <w:b/>
+          <w:bCs/>
+        </w:rPr>
+        <w:t xml:space="preserve">Evidence:</w:t>
+      </w:r>
+      <w:r>
+        <w:t xml:space="preserve"> </w:t>
+      </w:r>
+      <w:r>
+        <w:t xml:space="preserve">docs/qa/followup_fixes_20260712T085616Z/HXC124_evidence.md</w:t>
+      </w:r>
+      <w:r>
+        <w:t xml:space="preserve"> </w:t>
+      </w:r>
+      <w:r>
+        <w:rPr>
+          <w:b/>
+          <w:bCs/>
+        </w:rPr>
+        <w:t xml:space="preserve">Severity:</w:t>
+      </w:r>
+      <w:r>
+        <w:t xml:space="preserve"> </w:t>
+      </w:r>
+      <w:r>
+        <w:t xml:space="preserve">Medium</w:t>
+      </w:r>
+      <w:r>
+        <w:t xml:space="preserve"> </w:t>
+      </w:r>
+      <w:r>
+        <w:rPr>
+          <w:b/>
+          <w:bCs/>
+        </w:rPr>
+        <w:t xml:space="preserve">Created-By:</w:t>
+      </w:r>
+      <w:r>
+        <w:t xml:space="preserve"> </w:t>
+      </w:r>
+      <w:r>
+        <w:t xml:space="preserve">Claude</w:t>
+      </w:r>
+    </w:p>
+    <w:p>
+      <w:pPr>
+        <w:pStyle w:val="BodyText"/>
+      </w:pPr>
+      <w:r>
+        <w:t xml:space="preserve">One automated quality-assurance test bank that drives real server workflows has a documented gap: it cannot mint the authentication token needed to finish the workflow end-to-end without manual help, so it does not meet the fully-automated no-human-intervention standard. The work provides an automated way to obtain a valid token during the test so the workflow runs unattended. The QA bank then becomes fully automated and re-runnable.</w:t>
+      </w:r>
+    </w:p>
+    <w:bookmarkEnd w:id="101"/>
+    <w:bookmarkStart w:id="102" w:name="X68ae13fe03bcfe6e43da35677810dc9664e29a3"/>
+    <w:p>
+      <w:pPr>
+        <w:pStyle w:val="Heading2"/>
+      </w:pPr>
+      <w:r>
+        <w:t xml:space="preserve">HXC-131 — Cognee client authentication and bearer-token caching regressed</w:t>
+      </w:r>
+    </w:p>
+    <w:p>
+      <w:pPr>
+        <w:pStyle w:val="FirstParagraph"/>
+      </w:pPr>
+      <w:r>
+        <w:rPr>
+          <w:b/>
+          <w:bCs/>
+        </w:rPr>
+        <w:t xml:space="preserve">Status:</w:t>
+      </w:r>
+      <w:r>
+        <w:t xml:space="preserve"> </w:t>
+      </w:r>
+      <w:r>
+        <w:t xml:space="preserve">Obsolete (→ Fixed.md)</w:t>
+      </w:r>
+      <w:r>
+        <w:t xml:space="preserve"> </w:t>
+      </w:r>
+      <w:r>
+        <w:rPr>
+          <w:b/>
+          <w:bCs/>
+        </w:rPr>
+        <w:t xml:space="preserve">Type:</w:t>
+      </w:r>
+      <w:r>
+        <w:t xml:space="preserve"> </w:t>
+      </w:r>
+      <w:r>
+        <w:t xml:space="preserve">Bug</w:t>
+      </w:r>
+      <w:r>
+        <w:t xml:space="preserve"> </w:t>
+      </w:r>
+      <w:r>
+        <w:rPr>
+          <w:b/>
+          <w:bCs/>
+        </w:rPr>
+        <w:t xml:space="preserve">Evidence:</w:t>
+      </w:r>
+      <w:r>
+        <w:t xml:space="preserve"> </w:t>
+      </w:r>
+      <w:r>
+        <w:t xml:space="preserve">docs/qa/followup_fixes_20260712T085616Z/HXC131_evidence.md</w:t>
+      </w:r>
+      <w:r>
+        <w:t xml:space="preserve"> </w:t>
+      </w:r>
+      <w:r>
+        <w:rPr>
+          <w:b/>
+          <w:bCs/>
+        </w:rPr>
+        <w:t xml:space="preserve">Severity:</w:t>
+      </w:r>
+      <w:r>
+        <w:t xml:space="preserve"> </w:t>
+      </w:r>
+      <w:r>
+        <w:t xml:space="preserve">Medium</w:t>
+      </w:r>
+      <w:r>
+        <w:t xml:space="preserve"> </w:t>
+      </w:r>
+      <w:r>
+        <w:rPr>
+          <w:b/>
+          <w:bCs/>
+        </w:rPr>
+        <w:t xml:space="preserve">Created-By:</w:t>
+      </w:r>
+      <w:r>
+        <w:t xml:space="preserve"> </w:t>
+      </w:r>
+      <w:r>
+        <w:t xml:space="preserve">Claude</w:t>
+      </w:r>
+      <w:r>
+        <w:t xml:space="preserve"> </w:t>
+      </w:r>
+      <w:r>
+        <w:rPr>
+          <w:b/>
+          <w:bCs/>
+        </w:rPr>
+        <w:t xml:space="preserve">Obsolete-Details:</w:t>
+      </w:r>
+      <w:r>
+        <w:t xml:space="preserve"> </w:t>
+      </w:r>
+      <w:r>
+        <w:t xml:space="preserve">Since: 2026-07-12; Reason: duplicate-of; Superseding-item: b058c7c2; Triple-check evidence: docs/qa/followup_fixes_20260712T085616Z/HXC131_evidence.md</w:t>
+      </w:r>
+    </w:p>
+    <w:p>
+      <w:pPr>
+        <w:pStyle w:val="BodyText"/>
+      </w:pPr>
+      <w:r>
+        <w:t xml:space="preserve">The client that talks to the Cognee memory service stopped completing its login and caching the access token — its tests show the login endpoint is never called and no bearer token is stored, so authenticated calls would fail. This means memory features that rely on Cognee cannot authenticate reliably. The work is to restore the login-then-cache-token flow and prove it with the existing auth tests. Users regain dependable access to Cognee-backed memory.</w:t>
+      </w:r>
+    </w:p>
+    <w:bookmarkEnd w:id="102"/>
+    <w:bookmarkEnd w:id="103"/>
     <w:sectPr>
       <w:footnotePr>
         <w:numRestart w:val="eachSect"/>

</xml_diff>

<commit_message>
close(HXC-132): compose build-path + server-URL config fixed (→ Fixed.md)
Co-Authored-By: Claude Opus 4.8 <noreply@anthropic.com>
</commit_message>
<xml_diff>
--- a/docs/Fixed.docx
+++ b/docs/Fixed.docx
@@ -2,7 +2,7 @@
 <file path=word/document.xml><?xml version="1.0" encoding="utf-8"?>
 <w:document xmlns:w="http://schemas.openxmlformats.org/wordprocessingml/2006/main" xmlns:m="http://schemas.openxmlformats.org/officeDocument/2006/math" xmlns:r="http://schemas.openxmlformats.org/officeDocument/2006/relationships" xmlns:o="urn:schemas-microsoft-com:office:office" xmlns:v="urn:schemas-microsoft-com:vml" xmlns:w10="urn:schemas-microsoft-com:office:word" xmlns:a="http://schemas.openxmlformats.org/drawingml/2006/main" xmlns:pic="http://schemas.openxmlformats.org/drawingml/2006/picture" xmlns:wp="http://schemas.openxmlformats.org/drawingml/2006/wordprocessingDrawing">
   <w:body>
-    <w:bookmarkStart w:id="103" w:name="helixcode-fixed-items-tracker"/>
+    <w:bookmarkStart w:id="104" w:name="helixcode-fixed-items-tracker"/>
     <w:p>
       <w:pPr>
         <w:pStyle w:val="Heading1"/>
@@ -30500,7 +30500,107 @@
       </w:r>
     </w:p>
     <w:bookmarkEnd w:id="102"/>
+    <w:bookmarkStart w:id="103" w:name="Xbff0032a6fefe8568cce2ea9af75fb4e11d3a07"/>
+    <w:p>
+      <w:pPr>
+        <w:pStyle w:val="Heading2"/>
+      </w:pPr>
+      <w:r>
+        <w:t xml:space="preserve">HXC-132 — Full-test container stack cannot build the HelixCode server and tests hardcode port 8080</w:t>
+      </w:r>
+    </w:p>
+    <w:p>
+      <w:pPr>
+        <w:pStyle w:val="FirstParagraph"/>
+      </w:pPr>
+      <w:r>
+        <w:rPr>
+          <w:b/>
+          <w:bCs/>
+        </w:rPr>
+        <w:t xml:space="preserve">Status:</w:t>
+      </w:r>
+      <w:r>
+        <w:t xml:space="preserve"> </w:t>
+      </w:r>
+      <w:r>
+        <w:t xml:space="preserve">Completed (→ Fixed.md)</w:t>
+      </w:r>
+      <w:r>
+        <w:t xml:space="preserve"> </w:t>
+      </w:r>
+      <w:r>
+        <w:rPr>
+          <w:b/>
+          <w:bCs/>
+        </w:rPr>
+        <w:t xml:space="preserve">Type:</w:t>
+      </w:r>
+      <w:r>
+        <w:t xml:space="preserve"> </w:t>
+      </w:r>
+      <w:r>
+        <w:t xml:space="preserve">Task</w:t>
+      </w:r>
+      <w:r>
+        <w:t xml:space="preserve"> </w:t>
+      </w:r>
+      <w:r>
+        <w:rPr>
+          <w:b/>
+          <w:bCs/>
+        </w:rPr>
+        <w:t xml:space="preserve">Evidence:</w:t>
+      </w:r>
+      <w:r>
+        <w:t xml:space="preserve"> </w:t>
+      </w:r>
+      <w:r>
+        <w:t xml:space="preserve">docs/qa/hxc132_20260712T090048Z/HXC132_evidence.md</w:t>
+      </w:r>
+      <w:r>
+        <w:t xml:space="preserve"> </w:t>
+      </w:r>
+      <w:r>
+        <w:rPr>
+          <w:b/>
+          <w:bCs/>
+        </w:rPr>
+        <w:t xml:space="preserve">Severity:</w:t>
+      </w:r>
+      <w:r>
+        <w:t xml:space="preserve"> </w:t>
+      </w:r>
+      <w:r>
+        <w:t xml:space="preserve">Medium</w:t>
+      </w:r>
+      <w:r>
+        <w:t xml:space="preserve"> </w:t>
+      </w:r>
+      <w:r>
+        <w:rPr>
+          <w:b/>
+          <w:bCs/>
+        </w:rPr>
+        <w:t xml:space="preserve">Created-By:</w:t>
+      </w:r>
+      <w:r>
+        <w:t xml:space="preserve"> </w:t>
+      </w:r>
+      <w:r>
+        <w:t xml:space="preserve">Claude</w:t>
+      </w:r>
+    </w:p>
+    <w:p>
+      <w:pPr>
+        <w:pStyle w:val="BodyText"/>
+      </w:pPr>
+      <w:r>
+        <w:t xml:space="preserve">The full-infrastructure test stack fails to build the HelixCode server container because its build recipe points at a Dockerfile path that does not exist, and many memory and security tests skip themselves because they look for a server on a fixed port 8080 with no way to override it. As a result a whole class of tests never run against a real server. The work is to fix the container build path and make the server URL configurable so those tests execute. This unlocks real end-to-end coverage of server-dependent features.</w:t>
+      </w:r>
+    </w:p>
     <w:bookmarkEnd w:id="103"/>
+    <w:bookmarkEnd w:id="104"/>
     <w:sectPr>
       <w:footnotePr>
         <w:numRestart w:val="eachSect"/>

</xml_diff>

<commit_message>
qa+plan(HXC-137): submodule health sweep complete (66 modules) + 3 defect items tracked
65/66 build, 64/66 vet, 63/66 tests pass. New items: helix_agent vendored-fixture build-break (High),
helix_qa mutex-copy + testbank fail (Med), mcp_module Docker-adapter nil-ptr on stop-not-started (Med).
Evidence docs/qa/submodule_health_20260712/. HXC-137 closed. diff in-sync.

Co-Authored-By: Claude Opus 4.8 <noreply@anthropic.com>
</commit_message>
<xml_diff>
--- a/docs/Fixed.docx
+++ b/docs/Fixed.docx
@@ -2,7 +2,7 @@
 <file path=word/document.xml><?xml version="1.0" encoding="utf-8"?>
 <w:document xmlns:w="http://schemas.openxmlformats.org/wordprocessingml/2006/main" xmlns:m="http://schemas.openxmlformats.org/officeDocument/2006/math" xmlns:r="http://schemas.openxmlformats.org/officeDocument/2006/relationships" xmlns:o="urn:schemas-microsoft-com:office:office" xmlns:v="urn:schemas-microsoft-com:vml" xmlns:w10="urn:schemas-microsoft-com:office:word" xmlns:a="http://schemas.openxmlformats.org/drawingml/2006/main" xmlns:pic="http://schemas.openxmlformats.org/drawingml/2006/picture" xmlns:wp="http://schemas.openxmlformats.org/drawingml/2006/wordprocessingDrawing">
   <w:body>
-    <w:bookmarkStart w:id="104" w:name="helixcode-fixed-items-tracker"/>
+    <w:bookmarkStart w:id="105" w:name="helixcode-fixed-items-tracker"/>
     <w:p>
       <w:pPr>
         <w:pStyle w:val="Heading1"/>
@@ -30600,7 +30600,107 @@
       </w:r>
     </w:p>
     <w:bookmarkEnd w:id="103"/>
+    <w:bookmarkStart w:id="104" w:name="X93a4629179f8f26f2f3b3874a318ce7dbf58ebf"/>
+    <w:p>
+      <w:pPr>
+        <w:pStyle w:val="Heading2"/>
+      </w:pPr>
+      <w:r>
+        <w:t xml:space="preserve">HXC-137 — Re-verify every owned code module builds, checks, and tests cleanly</w:t>
+      </w:r>
+    </w:p>
+    <w:p>
+      <w:pPr>
+        <w:pStyle w:val="FirstParagraph"/>
+      </w:pPr>
+      <w:r>
+        <w:rPr>
+          <w:b/>
+          <w:bCs/>
+        </w:rPr>
+        <w:t xml:space="preserve">Status:</w:t>
+      </w:r>
+      <w:r>
+        <w:t xml:space="preserve"> </w:t>
+      </w:r>
+      <w:r>
+        <w:t xml:space="preserve">Completed (→ Fixed.md)</w:t>
+      </w:r>
+      <w:r>
+        <w:t xml:space="preserve"> </w:t>
+      </w:r>
+      <w:r>
+        <w:rPr>
+          <w:b/>
+          <w:bCs/>
+        </w:rPr>
+        <w:t xml:space="preserve">Type:</w:t>
+      </w:r>
+      <w:r>
+        <w:t xml:space="preserve"> </w:t>
+      </w:r>
+      <w:r>
+        <w:t xml:space="preserve">Task</w:t>
+      </w:r>
+      <w:r>
+        <w:t xml:space="preserve"> </w:t>
+      </w:r>
+      <w:r>
+        <w:rPr>
+          <w:b/>
+          <w:bCs/>
+        </w:rPr>
+        <w:t xml:space="preserve">Evidence:</w:t>
+      </w:r>
+      <w:r>
+        <w:t xml:space="preserve"> </w:t>
+      </w:r>
+      <w:r>
+        <w:t xml:space="preserve">docs/qa/submodule_health_20260712/results.csv</w:t>
+      </w:r>
+      <w:r>
+        <w:t xml:space="preserve"> </w:t>
+      </w:r>
+      <w:r>
+        <w:rPr>
+          <w:b/>
+          <w:bCs/>
+        </w:rPr>
+        <w:t xml:space="preserve">Severity:</w:t>
+      </w:r>
+      <w:r>
+        <w:t xml:space="preserve"> </w:t>
+      </w:r>
+      <w:r>
+        <w:t xml:space="preserve">Medium</w:t>
+      </w:r>
+      <w:r>
+        <w:t xml:space="preserve"> </w:t>
+      </w:r>
+      <w:r>
+        <w:rPr>
+          <w:b/>
+          <w:bCs/>
+        </w:rPr>
+        <w:t xml:space="preserve">Created-By:</w:t>
+      </w:r>
+      <w:r>
+        <w:t xml:space="preserve"> </w:t>
+      </w:r>
+      <w:r>
+        <w:t xml:space="preserve">Claude</w:t>
+      </w:r>
+    </w:p>
+    <w:p>
+      <w:pPr>
+        <w:pStyle w:val="BodyText"/>
+      </w:pPr>
+      <w:r>
+        <w:t xml:space="preserve">The project depends on many owned code modules, and a full health check of all of them (does each build, pass static checks, and pass its tests) did not finish in the latest session. The work is to run that complete health sweep and record the result for every module. This assures that the whole codebase, not just the main application, is in good shape.</w:t>
+      </w:r>
+    </w:p>
     <w:bookmarkEnd w:id="104"/>
+    <w:bookmarkEnd w:id="105"/>
     <w:sectPr>
       <w:footnotePr>
         <w:numRestart w:val="eachSect"/>

</xml_diff>

<commit_message>
close(HXC-139): isolate vendored cli_agents/ from helix_agent build (→ Fixed.md)
helix_agent ecbbf1e0 adds a nested-module marker cli_agents/go.mod excluding the
vendored third-party reference-agent tree (Continue submodule fixture with a
domain-less import) from dev.helix.agent, unbreaking `go build ./...` /
`go vet ./...`; + a §11.4.115/§11.4.135 RED-polarity regression guard. Third-party
Continue submodule NOT modified (§11.4.28/§11.4.51). Independent review GO, zero
findings, §1.1 non-tautology verified.

- Bump submodules/helix_agent pointer → ecbbf1e0 (pushed ff-only to all 4 mirrors).
- Close HXC-139 (Bug/High) Issues→Fixed via workable-items; validate OK (335 items),
  diff=0 (DB↔trackers in sync), WAL-checkpointed (§11.4.95).
- Evidence: docs/qa/hxc139_20260712T102230Z/EVIDENCE.md (§11.4.83).
- 11 Queued items remain.

Co-Authored-By: Claude Opus 4.8 <noreply@anthropic.com>
</commit_message>
<xml_diff>
--- a/docs/Fixed.docx
+++ b/docs/Fixed.docx
@@ -2,7 +2,7 @@
 <file path=word/document.xml><?xml version="1.0" encoding="utf-8"?>
 <w:document xmlns:w="http://schemas.openxmlformats.org/wordprocessingml/2006/main" xmlns:m="http://schemas.openxmlformats.org/officeDocument/2006/math" xmlns:r="http://schemas.openxmlformats.org/officeDocument/2006/relationships" xmlns:o="urn:schemas-microsoft-com:office:office" xmlns:v="urn:schemas-microsoft-com:vml" xmlns:w10="urn:schemas-microsoft-com:office:word" xmlns:a="http://schemas.openxmlformats.org/drawingml/2006/main" xmlns:pic="http://schemas.openxmlformats.org/drawingml/2006/picture" xmlns:wp="http://schemas.openxmlformats.org/drawingml/2006/wordprocessingDrawing">
   <w:body>
-    <w:bookmarkStart w:id="105" w:name="helixcode-fixed-items-tracker"/>
+    <w:bookmarkStart w:id="106" w:name="helixcode-fixed-items-tracker"/>
     <w:p>
       <w:pPr>
         <w:pStyle w:val="Heading1"/>
@@ -30700,7 +30700,107 @@
       </w:r>
     </w:p>
     <w:bookmarkEnd w:id="104"/>
+    <w:bookmarkStart w:id="105" w:name="X7677f2ea40b1d34917e2dae50ffe0b06a4a204e"/>
+    <w:p>
+      <w:pPr>
+        <w:pStyle w:val="Heading2"/>
+      </w:pPr>
+      <w:r>
+        <w:t xml:space="preserve">HXC-139 — A vendored reference-agent fixture breaks the helix_agent module build</w:t>
+      </w:r>
+    </w:p>
+    <w:p>
+      <w:pPr>
+        <w:pStyle w:val="FirstParagraph"/>
+      </w:pPr>
+      <w:r>
+        <w:rPr>
+          <w:b/>
+          <w:bCs/>
+        </w:rPr>
+        <w:t xml:space="preserve">Status:</w:t>
+      </w:r>
+      <w:r>
+        <w:t xml:space="preserve"> </w:t>
+      </w:r>
+      <w:r>
+        <w:t xml:space="preserve">Fixed (→ Fixed.md)</w:t>
+      </w:r>
+      <w:r>
+        <w:t xml:space="preserve"> </w:t>
+      </w:r>
+      <w:r>
+        <w:rPr>
+          <w:b/>
+          <w:bCs/>
+        </w:rPr>
+        <w:t xml:space="preserve">Type:</w:t>
+      </w:r>
+      <w:r>
+        <w:t xml:space="preserve"> </w:t>
+      </w:r>
+      <w:r>
+        <w:t xml:space="preserve">Bug</w:t>
+      </w:r>
+      <w:r>
+        <w:t xml:space="preserve"> </w:t>
+      </w:r>
+      <w:r>
+        <w:rPr>
+          <w:b/>
+          <w:bCs/>
+        </w:rPr>
+        <w:t xml:space="preserve">Evidence:</w:t>
+      </w:r>
+      <w:r>
+        <w:t xml:space="preserve"> </w:t>
+      </w:r>
+      <w:r>
+        <w:t xml:space="preserve">/home/milos/Factory/projects/tools_and_research/helix_code/docs/qa/hxc139_20260712T102230Z/EVIDENCE.md</w:t>
+      </w:r>
+      <w:r>
+        <w:t xml:space="preserve"> </w:t>
+      </w:r>
+      <w:r>
+        <w:rPr>
+          <w:b/>
+          <w:bCs/>
+        </w:rPr>
+        <w:t xml:space="preserve">Severity:</w:t>
+      </w:r>
+      <w:r>
+        <w:t xml:space="preserve"> </w:t>
+      </w:r>
+      <w:r>
+        <w:t xml:space="preserve">High</w:t>
+      </w:r>
+      <w:r>
+        <w:t xml:space="preserve"> </w:t>
+      </w:r>
+      <w:r>
+        <w:rPr>
+          <w:b/>
+          <w:bCs/>
+        </w:rPr>
+        <w:t xml:space="preserve">Created-By:</w:t>
+      </w:r>
+      <w:r>
+        <w:t xml:space="preserve"> </w:t>
+      </w:r>
+      <w:r>
+        <w:t xml:space="preserve">Claude</w:t>
+      </w:r>
+    </w:p>
+    <w:p>
+      <w:pPr>
+        <w:pStyle w:val="BodyText"/>
+      </w:pPr>
+      <w:r>
+        <w:t xml:space="preserve">A vendored copy of a third-party reference coding-agent (the Continue project) includes a Go source file that imports a path that does not exist, and because that file has no separate module marker it gets swept into the helix_agent module’s build — breaking the build and static checks for the whole module. This blocks reliable building and testing of the agent module. The work is to isolate those vendored reference files so they are not compiled as part of our module (a build-ignore or nested module marker). Developers regain a clean, buildable agent module.</w:t>
+      </w:r>
+    </w:p>
     <w:bookmarkEnd w:id="105"/>
+    <w:bookmarkEnd w:id="106"/>
     <w:sectPr>
       <w:footnotePr>
         <w:numRestart w:val="eachSect"/>

</xml_diff>

<commit_message>
close(HXC-141): DockerAdapter.Stop idempotent safe no-op (→ Fixed.md)
mcp_module 4b01534 makes DockerAdapter.Stop robust against stop-before-start /
missing-container (never-started guard + "no such container" handling +
race-safe containerID access), fixing the nil-pointer crash a caller hit when
Stop returned nil on a podman-as-docker host and the caller dereferenced the
(nil) error. §11.4.120 reconciled the 3 existing Stop tests + hermetic matcher
+ -race concurrency guard. Independent review GO (2 rounds), §1.1 verified
(matcher mutation + data-race mutation both caught).

- Bump submodules/mcp_module pointer -> 4b01534 (pushed ff-only, both mirrors).
- Close HXC-141 (Bug/Med) Issues->Fixed; validate OK (335), diff=0, WAL-checkpointed.
- Evidence: docs/qa/hxc141_20260712T111849Z/EVIDENCE.md. 10 Queued remain.

Co-Authored-By: Claude Opus 4.8 <noreply@anthropic.com>
</commit_message>
<xml_diff>
--- a/docs/Fixed.docx
+++ b/docs/Fixed.docx
@@ -2,7 +2,7 @@
 <file path=word/document.xml><?xml version="1.0" encoding="utf-8"?>
 <w:document xmlns:w="http://schemas.openxmlformats.org/wordprocessingml/2006/main" xmlns:m="http://schemas.openxmlformats.org/officeDocument/2006/math" xmlns:r="http://schemas.openxmlformats.org/officeDocument/2006/relationships" xmlns:o="urn:schemas-microsoft-com:office:office" xmlns:v="urn:schemas-microsoft-com:vml" xmlns:w10="urn:schemas-microsoft-com:office:word" xmlns:a="http://schemas.openxmlformats.org/drawingml/2006/main" xmlns:pic="http://schemas.openxmlformats.org/drawingml/2006/picture" xmlns:wp="http://schemas.openxmlformats.org/drawingml/2006/wordprocessingDrawing">
   <w:body>
-    <w:bookmarkStart w:id="106" w:name="helixcode-fixed-items-tracker"/>
+    <w:bookmarkStart w:id="107" w:name="helixcode-fixed-items-tracker"/>
     <w:p>
       <w:pPr>
         <w:pStyle w:val="Heading1"/>
@@ -30800,7 +30800,107 @@
       </w:r>
     </w:p>
     <w:bookmarkEnd w:id="105"/>
+    <w:bookmarkStart w:id="106" w:name="Xad006607daa212b5eb975cee80c5dc189a8bb30"/>
+    <w:p>
+      <w:pPr>
+        <w:pStyle w:val="Heading2"/>
+      </w:pPr>
+      <w:r>
+        <w:t xml:space="preserve">HXC-141 — mcp_module Docker adapter crashes when stopping a container that was never started</w:t>
+      </w:r>
+    </w:p>
+    <w:p>
+      <w:pPr>
+        <w:pStyle w:val="FirstParagraph"/>
+      </w:pPr>
+      <w:r>
+        <w:rPr>
+          <w:b/>
+          <w:bCs/>
+        </w:rPr>
+        <w:t xml:space="preserve">Status:</w:t>
+      </w:r>
+      <w:r>
+        <w:t xml:space="preserve"> </w:t>
+      </w:r>
+      <w:r>
+        <w:t xml:space="preserve">Fixed (→ Fixed.md)</w:t>
+      </w:r>
+      <w:r>
+        <w:t xml:space="preserve"> </w:t>
+      </w:r>
+      <w:r>
+        <w:rPr>
+          <w:b/>
+          <w:bCs/>
+        </w:rPr>
+        <w:t xml:space="preserve">Type:</w:t>
+      </w:r>
+      <w:r>
+        <w:t xml:space="preserve"> </w:t>
+      </w:r>
+      <w:r>
+        <w:t xml:space="preserve">Bug</w:t>
+      </w:r>
+      <w:r>
+        <w:t xml:space="preserve"> </w:t>
+      </w:r>
+      <w:r>
+        <w:rPr>
+          <w:b/>
+          <w:bCs/>
+        </w:rPr>
+        <w:t xml:space="preserve">Evidence:</w:t>
+      </w:r>
+      <w:r>
+        <w:t xml:space="preserve"> </w:t>
+      </w:r>
+      <w:r>
+        <w:t xml:space="preserve">/home/milos/Factory/projects/tools_and_research/helix_code/docs/qa/hxc141_20260712T111849Z/EVIDENCE.md</w:t>
+      </w:r>
+      <w:r>
+        <w:t xml:space="preserve"> </w:t>
+      </w:r>
+      <w:r>
+        <w:rPr>
+          <w:b/>
+          <w:bCs/>
+        </w:rPr>
+        <w:t xml:space="preserve">Severity:</w:t>
+      </w:r>
+      <w:r>
+        <w:t xml:space="preserve"> </w:t>
+      </w:r>
+      <w:r>
+        <w:t xml:space="preserve">Medium</w:t>
+      </w:r>
+      <w:r>
+        <w:t xml:space="preserve"> </w:t>
+      </w:r>
+      <w:r>
+        <w:rPr>
+          <w:b/>
+          <w:bCs/>
+        </w:rPr>
+        <w:t xml:space="preserve">Created-By:</w:t>
+      </w:r>
+      <w:r>
+        <w:t xml:space="preserve"> </w:t>
+      </w:r>
+      <w:r>
+        <w:t xml:space="preserve">Claude</w:t>
+      </w:r>
+    </w:p>
+    <w:p>
+      <w:pPr>
+        <w:pStyle w:val="BodyText"/>
+      </w:pPr>
+      <w:r>
+        <w:t xml:space="preserve">The MCP module’s Docker adapter crashes with a null-pointer error when asked to stop a container that was never started or does not exist, instead of returning cleanly. This can bring down callers that expect a safe no-op. The work is to guard the stop path so a not-started or missing container is handled gracefully. The adapter becomes robust against stop-before-start and missing-container situations.</w:t>
+      </w:r>
+    </w:p>
     <w:bookmarkEnd w:id="106"/>
+    <w:bookmarkEnd w:id="107"/>
     <w:sectPr>
       <w:footnotePr>
         <w:numRestart w:val="eachSect"/>

</xml_diff>

<commit_message>
close(HXC-117): surface verifier-sourced CONST-040 capability flags to users (→ Fixed.md)
Source fix aa6b20b4 (helix_code): CLI printVerifiedModels + server verifiedModelToJSON now
display all 6 capability flags (MCP/LSP/ACP/RAG/Skills/Plugins) from the decoded VerifiedModel
Supports* fields (verifier single-source, no hardcoding — CONST-040). Fallback path renders an
honest i18n 'unknown' indicator (no <no value> leak, §11.4.1). CONST-046: Skills/Plugins labels +
indicators moved to i18n. Guards per-flag anti-constant + fallback-no-leak. Independent review
2 rounds → clean GO/0 (3 §1.1 mutations proven). 358 tests PASS (-tags=nogui).

Closure vocab Fixed (§11.4.33, Bug). DB→docs regenerated (--out-dir docs) + WAL-checkpointed;
CM-WORKABLE-ITEMS-MD-DB-IN-SYNC PASS. Evidence docs/qa/hxc117_20260712T140900Z/.

Co-Authored-By: Claude Opus 4.8 <noreply@anthropic.com>
</commit_message>
<xml_diff>
--- a/docs/Fixed.docx
+++ b/docs/Fixed.docx
@@ -2,7 +2,7 @@
 <file path=word/document.xml><?xml version="1.0" encoding="utf-8"?>
 <w:document xmlns:w="http://schemas.openxmlformats.org/wordprocessingml/2006/main" xmlns:m="http://schemas.openxmlformats.org/officeDocument/2006/math" xmlns:r="http://schemas.openxmlformats.org/officeDocument/2006/relationships" xmlns:o="urn:schemas-microsoft-com:office:office" xmlns:v="urn:schemas-microsoft-com:vml" xmlns:w10="urn:schemas-microsoft-com:office:word" xmlns:a="http://schemas.openxmlformats.org/drawingml/2006/main" xmlns:pic="http://schemas.openxmlformats.org/drawingml/2006/picture" xmlns:wp="http://schemas.openxmlformats.org/drawingml/2006/wordprocessingDrawing">
   <w:body>
-    <w:bookmarkStart w:id="110" w:name="helixcode-fixed-items-tracker"/>
+    <w:bookmarkStart w:id="111" w:name="helixcode-fixed-items-tracker"/>
     <w:p>
       <w:pPr>
         <w:pStyle w:val="Heading1"/>
@@ -31200,7 +31200,107 @@
       </w:r>
     </w:p>
     <w:bookmarkEnd w:id="109"/>
+    <w:bookmarkStart w:id="110" w:name="X6e94c9106c0de225fda42baa2d944740cbfd042"/>
+    <w:p>
+      <w:pPr>
+        <w:pStyle w:val="Heading2"/>
+      </w:pPr>
+      <w:r>
+        <w:t xml:space="preserve">HXC-117 — Model capability flags (MCP, LSP, ACP, RAG, Skills, Plugins) are not sourced from the verifier as required</w:t>
+      </w:r>
+    </w:p>
+    <w:p>
+      <w:pPr>
+        <w:pStyle w:val="FirstParagraph"/>
+      </w:pPr>
+      <w:r>
+        <w:rPr>
+          <w:b/>
+          <w:bCs/>
+        </w:rPr>
+        <w:t xml:space="preserve">Status:</w:t>
+      </w:r>
+      <w:r>
+        <w:t xml:space="preserve"> </w:t>
+      </w:r>
+      <w:r>
+        <w:t xml:space="preserve">Fixed (→ Fixed.md)</w:t>
+      </w:r>
+      <w:r>
+        <w:t xml:space="preserve"> </w:t>
+      </w:r>
+      <w:r>
+        <w:rPr>
+          <w:b/>
+          <w:bCs/>
+        </w:rPr>
+        <w:t xml:space="preserve">Type:</w:t>
+      </w:r>
+      <w:r>
+        <w:t xml:space="preserve"> </w:t>
+      </w:r>
+      <w:r>
+        <w:t xml:space="preserve">Bug</w:t>
+      </w:r>
+      <w:r>
+        <w:t xml:space="preserve"> </w:t>
+      </w:r>
+      <w:r>
+        <w:rPr>
+          <w:b/>
+          <w:bCs/>
+        </w:rPr>
+        <w:t xml:space="preserve">Evidence:</w:t>
+      </w:r>
+      <w:r>
+        <w:t xml:space="preserve"> </w:t>
+      </w:r>
+      <w:r>
+        <w:t xml:space="preserve">docs/qa/hxc117_20260712T140900Z/EVIDENCE.md</w:t>
+      </w:r>
+      <w:r>
+        <w:t xml:space="preserve"> </w:t>
+      </w:r>
+      <w:r>
+        <w:rPr>
+          <w:b/>
+          <w:bCs/>
+        </w:rPr>
+        <w:t xml:space="preserve">Severity:</w:t>
+      </w:r>
+      <w:r>
+        <w:t xml:space="preserve"> </w:t>
+      </w:r>
+      <w:r>
+        <w:t xml:space="preserve">High</w:t>
+      </w:r>
+      <w:r>
+        <w:t xml:space="preserve"> </w:t>
+      </w:r>
+      <w:r>
+        <w:rPr>
+          <w:b/>
+          <w:bCs/>
+        </w:rPr>
+        <w:t xml:space="preserve">Created-By:</w:t>
+      </w:r>
+      <w:r>
+        <w:t xml:space="preserve"> </w:t>
+      </w:r>
+      <w:r>
+        <w:t xml:space="preserve">Claude</w:t>
+      </w:r>
+    </w:p>
+    <w:p>
+      <w:pPr>
+        <w:pStyle w:val="BodyText"/>
+      </w:pPr>
+      <w:r>
+        <w:t xml:space="preserve">Governance rule CONST-040 requires that every advanced capability a model supports be reported by the central verifier component rather than hardcoded. Today the verifier only records whether a model supports embeddings; the other six capabilities are documented as verifier-sourced but are not implemented there. As a result the product cannot truthfully tell users which models support which capabilities. The work adds these capability fields to the verifier’s results and has the product read them from there. Users then receive accurate, single-source-of-truth capability information.</w:t>
+      </w:r>
+    </w:p>
     <w:bookmarkEnd w:id="110"/>
+    <w:bookmarkEnd w:id="111"/>
     <w:sectPr>
       <w:footnotePr>
         <w:numRestart w:val="eachSect"/>

</xml_diff>

<commit_message>
close(HXC-142,HXC-143): test/automation + test/e2e now compile; file HXC-147 (→ Fixed.md)
Source fix 2a3a81e3 (11 test files): adapted both suites to current provider API (llm.NewProvider/
ProviderConfigEntry, LLMRequest.Reasoning, ToolFunction, WorkerHealthHealthy, GetWorkerStats),
consolidated dup symbols, fixed malformed //go:build. Real assertions preserved (review §1.1:
GetWorkerStats +999 -> 3 tests FAIL; restored). Independent review GO/0-blocking, RED-on-parent->GREEN
in isolated worktree. Closure Fixed (§11.4.33, Bug). Evidence docs/qa/hxc142_143_20260712T150000Z/.

Filed HXC-147 (Bug/Med): OpenRouter automation nil-ptr on stale model deepseek-r1-free + missing
nil-check (found running the fixed binary; env has live provider keys = real API spend).

CM-WORKABLE-ITEMS-MD-DB-IN-SYNC + CM-NO-TERMINAL-ITEM-IN-ISSUES PASS.

Co-Authored-By: Claude Opus 4.8 <noreply@anthropic.com>
</commit_message>
<xml_diff>
--- a/docs/Fixed.docx
+++ b/docs/Fixed.docx
@@ -2,7 +2,7 @@
 <file path=word/document.xml><?xml version="1.0" encoding="utf-8"?>
 <w:document xmlns:w="http://schemas.openxmlformats.org/wordprocessingml/2006/main" xmlns:m="http://schemas.openxmlformats.org/officeDocument/2006/math" xmlns:r="http://schemas.openxmlformats.org/officeDocument/2006/relationships" xmlns:o="urn:schemas-microsoft-com:office:office" xmlns:v="urn:schemas-microsoft-com:vml" xmlns:w10="urn:schemas-microsoft-com:office:word" xmlns:a="http://schemas.openxmlformats.org/drawingml/2006/main" xmlns:pic="http://schemas.openxmlformats.org/drawingml/2006/picture" xmlns:wp="http://schemas.openxmlformats.org/drawingml/2006/wordprocessingDrawing">
   <w:body>
-    <w:bookmarkStart w:id="152" w:name="helixcode-fixed-items-tracker"/>
+    <w:bookmarkStart w:id="154" w:name="helixcode-fixed-items-tracker"/>
     <w:p>
       <w:pPr>
         <w:pStyle w:val="Heading1"/>
@@ -48612,7 +48612,207 @@
       </w:r>
     </w:p>
     <w:bookmarkEnd w:id="151"/>
+    <w:bookmarkStart w:id="152" w:name="Xbe03d6ca0453f7b0834e244be7a142ce1b56fd5"/>
+    <w:p>
+      <w:pPr>
+        <w:pStyle w:val="Heading2"/>
+      </w:pPr>
+      <w:r>
+        <w:t xml:space="preserve">HXC-142 — Automation test suite (test/automation, -tags=automation) does not compile</w:t>
+      </w:r>
+    </w:p>
+    <w:p>
+      <w:pPr>
+        <w:pStyle w:val="FirstParagraph"/>
+      </w:pPr>
+      <w:r>
+        <w:rPr>
+          <w:b/>
+          <w:bCs/>
+        </w:rPr>
+        <w:t xml:space="preserve">Status:</w:t>
+      </w:r>
+      <w:r>
+        <w:t xml:space="preserve"> </w:t>
+      </w:r>
+      <w:r>
+        <w:t xml:space="preserve">Fixed (→ Fixed.md)</w:t>
+      </w:r>
+      <w:r>
+        <w:t xml:space="preserve"> </w:t>
+      </w:r>
+      <w:r>
+        <w:rPr>
+          <w:b/>
+          <w:bCs/>
+        </w:rPr>
+        <w:t xml:space="preserve">Type:</w:t>
+      </w:r>
+      <w:r>
+        <w:t xml:space="preserve"> </w:t>
+      </w:r>
+      <w:r>
+        <w:t xml:space="preserve">Bug</w:t>
+      </w:r>
+      <w:r>
+        <w:t xml:space="preserve"> </w:t>
+      </w:r>
+      <w:r>
+        <w:rPr>
+          <w:b/>
+          <w:bCs/>
+        </w:rPr>
+        <w:t xml:space="preserve">Evidence:</w:t>
+      </w:r>
+      <w:r>
+        <w:t xml:space="preserve"> </w:t>
+      </w:r>
+      <w:r>
+        <w:t xml:space="preserve">docs/qa/hxc142_143_20260712T150000Z/EVIDENCE.md</w:t>
+      </w:r>
+      <w:r>
+        <w:t xml:space="preserve"> </w:t>
+      </w:r>
+      <w:r>
+        <w:rPr>
+          <w:b/>
+          <w:bCs/>
+        </w:rPr>
+        <w:t xml:space="preserve">Severity:</w:t>
+      </w:r>
+      <w:r>
+        <w:t xml:space="preserve"> </w:t>
+      </w:r>
+      <w:r>
+        <w:t xml:space="preserve">High</w:t>
+      </w:r>
+      <w:r>
+        <w:t xml:space="preserve"> </w:t>
+      </w:r>
+      <w:r>
+        <w:rPr>
+          <w:b/>
+          <w:bCs/>
+        </w:rPr>
+        <w:t xml:space="preserve">Created-By:</w:t>
+      </w:r>
+      <w:r>
+        <w:t xml:space="preserve"> </w:t>
+      </w:r>
+      <w:r>
+        <w:t xml:space="preserve">Claude</w:t>
+      </w:r>
+    </w:p>
+    <w:p>
+      <w:pPr>
+        <w:pStyle w:val="BodyText"/>
+      </w:pPr>
+      <w:r>
+        <w:t xml:space="preserve">The automation-tagged test package fails to build, so an entire mandated test type cannot execute at all. Two real causes were found during the 2026-07-12 real-infra retest: a duplicate symbol (isRateLimitError/contains declared in both xai and qwen automation test files) and deeper API drift where the tests reference llm.ProviderConfig and NewProviderManager which no longer exist in the current provider package. The work is to reconcile the automation tests with the current provider API and remove the duplicate helpers so the suite compiles and runs against real infrastructure. Evidence: docs/qa/infra_retest_20260712_hxc122_138/automation_tests.log.</w:t>
+      </w:r>
+    </w:p>
     <w:bookmarkEnd w:id="152"/>
+    <w:bookmarkStart w:id="153" w:name="X054ad3b558f7674e0fadf688fd66524f38df1ce"/>
+    <w:p>
+      <w:pPr>
+        <w:pStyle w:val="Heading2"/>
+      </w:pPr>
+      <w:r>
+        <w:t xml:space="preserve">HXC-143 — E2E test suite (test/e2e, -tags=e2e) does not compile due to redeclared getEnvOrDefault</w:t>
+      </w:r>
+    </w:p>
+    <w:p>
+      <w:pPr>
+        <w:pStyle w:val="FirstParagraph"/>
+      </w:pPr>
+      <w:r>
+        <w:rPr>
+          <w:b/>
+          <w:bCs/>
+        </w:rPr>
+        <w:t xml:space="preserve">Status:</w:t>
+      </w:r>
+      <w:r>
+        <w:t xml:space="preserve"> </w:t>
+      </w:r>
+      <w:r>
+        <w:t xml:space="preserve">Fixed (→ Fixed.md)</w:t>
+      </w:r>
+      <w:r>
+        <w:t xml:space="preserve"> </w:t>
+      </w:r>
+      <w:r>
+        <w:rPr>
+          <w:b/>
+          <w:bCs/>
+        </w:rPr>
+        <w:t xml:space="preserve">Type:</w:t>
+      </w:r>
+      <w:r>
+        <w:t xml:space="preserve"> </w:t>
+      </w:r>
+      <w:r>
+        <w:t xml:space="preserve">Bug</w:t>
+      </w:r>
+      <w:r>
+        <w:t xml:space="preserve"> </w:t>
+      </w:r>
+      <w:r>
+        <w:rPr>
+          <w:b/>
+          <w:bCs/>
+        </w:rPr>
+        <w:t xml:space="preserve">Evidence:</w:t>
+      </w:r>
+      <w:r>
+        <w:t xml:space="preserve"> </w:t>
+      </w:r>
+      <w:r>
+        <w:t xml:space="preserve">docs/qa/hxc142_143_20260712T150000Z/EVIDENCE.md</w:t>
+      </w:r>
+      <w:r>
+        <w:t xml:space="preserve"> </w:t>
+      </w:r>
+      <w:r>
+        <w:rPr>
+          <w:b/>
+          <w:bCs/>
+        </w:rPr>
+        <w:t xml:space="preserve">Severity:</w:t>
+      </w:r>
+      <w:r>
+        <w:t xml:space="preserve"> </w:t>
+      </w:r>
+      <w:r>
+        <w:t xml:space="preserve">High</w:t>
+      </w:r>
+      <w:r>
+        <w:t xml:space="preserve"> </w:t>
+      </w:r>
+      <w:r>
+        <w:rPr>
+          <w:b/>
+          <w:bCs/>
+        </w:rPr>
+        <w:t xml:space="preserve">Created-By:</w:t>
+      </w:r>
+      <w:r>
+        <w:t xml:space="preserve"> </w:t>
+      </w:r>
+      <w:r>
+        <w:t xml:space="preserve">Claude</w:t>
+      </w:r>
+    </w:p>
+    <w:p>
+      <w:pPr>
+        <w:pStyle w:val="BodyText"/>
+      </w:pPr>
+      <w:r>
+        <w:t xml:space="preserve">The e2e-tagged test package fails to build because getEnvOrDefault is declared more than once in the package, so another mandated test type cannot execute. The work is to remove the duplicate declaration (consolidate to a single shared helper) so the e2e suite compiles and can run end-to-end against a real server. Discovered during the 2026-07-12 real-infra retest. Evidence: docs/qa/infra_retest_20260712_hxc122_138/EVIDENCE.md.</w:t>
+      </w:r>
+    </w:p>
+    <w:bookmarkEnd w:id="153"/>
+    <w:bookmarkEnd w:id="154"/>
     <w:sectPr>
       <w:footnotePr>
         <w:numRestart w:val="eachSect"/>

</xml_diff>

<commit_message>
close(HXC-118): wire RAG into native server generate+stream endpoints; file HXC-148 (→ Fixed.md)
Source 225cdf77: applyRAGContext wired into generateLLM + streamLLM (mirrors CLI), graceful degrade,
disabled=byte-identical, RED_MODE polarity regression guard. Independent review GO/0-blocking, §1.1
proven (skip-PrependContext → 3 tests FAIL). Native generate API now RAG-capable. Closure Implemented
(§11.4.33, Feature). Evidence docs/qa/hxc118_20260712T151500Z/.

Filed HXC-148 (Task/Low): OpenAI/Anthropic wire-facade endpoints (/v1/chat/completions, /v1/messages)
still bypass RAG — secondary-surface follow-up (honest boundary, not over-claimed).

Gates PASS.

Co-Authored-By: Claude Opus 4.8 <noreply@anthropic.com>
</commit_message>
<xml_diff>
--- a/docs/Fixed.docx
+++ b/docs/Fixed.docx
@@ -2,7 +2,7 @@
 <file path=word/document.xml><?xml version="1.0" encoding="utf-8"?>
 <w:document xmlns:w="http://schemas.openxmlformats.org/wordprocessingml/2006/main" xmlns:m="http://schemas.openxmlformats.org/officeDocument/2006/math" xmlns:r="http://schemas.openxmlformats.org/officeDocument/2006/relationships" xmlns:o="urn:schemas-microsoft-com:office:office" xmlns:v="urn:schemas-microsoft-com:vml" xmlns:w10="urn:schemas-microsoft-com:office:word" xmlns:a="http://schemas.openxmlformats.org/drawingml/2006/main" xmlns:pic="http://schemas.openxmlformats.org/drawingml/2006/picture" xmlns:wp="http://schemas.openxmlformats.org/drawingml/2006/wordprocessingDrawing">
   <w:body>
-    <w:bookmarkStart w:id="154" w:name="helixcode-fixed-items-tracker"/>
+    <w:bookmarkStart w:id="155" w:name="helixcode-fixed-items-tracker"/>
     <w:p>
       <w:pPr>
         <w:pStyle w:val="Heading1"/>
@@ -48812,7 +48812,107 @@
       </w:r>
     </w:p>
     <w:bookmarkEnd w:id="153"/>
+    <w:bookmarkStart w:id="154" w:name="Xeb0cf67190292f2f8e325a1139727c1a6cfe04f"/>
+    <w:p>
+      <w:pPr>
+        <w:pStyle w:val="Heading2"/>
+      </w:pPr>
+      <w:r>
+        <w:t xml:space="preserve">HXC-118 — Retrieval-Augmented-Generation (RAG) module exists but is not connected to the application</w:t>
+      </w:r>
+    </w:p>
+    <w:p>
+      <w:pPr>
+        <w:pStyle w:val="FirstParagraph"/>
+      </w:pPr>
+      <w:r>
+        <w:rPr>
+          <w:b/>
+          <w:bCs/>
+        </w:rPr>
+        <w:t xml:space="preserve">Status:</w:t>
+      </w:r>
+      <w:r>
+        <w:t xml:space="preserve"> </w:t>
+      </w:r>
+      <w:r>
+        <w:t xml:space="preserve">Implemented (→ Fixed.md)</w:t>
+      </w:r>
+      <w:r>
+        <w:t xml:space="preserve"> </w:t>
+      </w:r>
+      <w:r>
+        <w:rPr>
+          <w:b/>
+          <w:bCs/>
+        </w:rPr>
+        <w:t xml:space="preserve">Type:</w:t>
+      </w:r>
+      <w:r>
+        <w:t xml:space="preserve"> </w:t>
+      </w:r>
+      <w:r>
+        <w:t xml:space="preserve">Feature</w:t>
+      </w:r>
+      <w:r>
+        <w:t xml:space="preserve"> </w:t>
+      </w:r>
+      <w:r>
+        <w:rPr>
+          <w:b/>
+          <w:bCs/>
+        </w:rPr>
+        <w:t xml:space="preserve">Evidence:</w:t>
+      </w:r>
+      <w:r>
+        <w:t xml:space="preserve"> </w:t>
+      </w:r>
+      <w:r>
+        <w:t xml:space="preserve">docs/qa/hxc118_20260712T151500Z/EVIDENCE.md</w:t>
+      </w:r>
+      <w:r>
+        <w:t xml:space="preserve"> </w:t>
+      </w:r>
+      <w:r>
+        <w:rPr>
+          <w:b/>
+          <w:bCs/>
+        </w:rPr>
+        <w:t xml:space="preserve">Severity:</w:t>
+      </w:r>
+      <w:r>
+        <w:t xml:space="preserve"> </w:t>
+      </w:r>
+      <w:r>
+        <w:t xml:space="preserve">High</w:t>
+      </w:r>
+      <w:r>
+        <w:t xml:space="preserve"> </w:t>
+      </w:r>
+      <w:r>
+        <w:rPr>
+          <w:b/>
+          <w:bCs/>
+        </w:rPr>
+        <w:t xml:space="preserve">Created-By:</w:t>
+      </w:r>
+      <w:r>
+        <w:t xml:space="preserve"> </w:t>
+      </w:r>
+      <w:r>
+        <w:t xml:space="preserve">Claude</w:t>
+      </w:r>
+    </w:p>
+    <w:p>
+      <w:pPr>
+        <w:pStyle w:val="BodyText"/>
+      </w:pPr>
+      <w:r>
+        <w:t xml:space="preserve">A dedicated Retrieval-Augmented-Generation component is maintained as its own reusable module, but the main application does not import or use it anywhere. A capability the product is expected to offer (answering using retrieved documents) is therefore effectively unavailable to end users despite the code existing. The work integrates the existing RAG module into the application, wires it into the request flow, and exposes its capability flag. Users gain working document-grounded answers instead of an orphaned, unused component.</w:t>
+      </w:r>
+    </w:p>
     <w:bookmarkEnd w:id="154"/>
+    <w:bookmarkEnd w:id="155"/>
     <w:sectPr>
       <w:footnotePr>
         <w:numRestart w:val="eachSect"/>

</xml_diff>

<commit_message>
close(HXC-144): stresschaos poll-until-stable settle + pprof-diff leak oracle (→ Fixed.md)
Source 4e03dd97 (3 test-harness files, no production): the retest's Server chaos 7/8 goroutine 'leak'
was a MEASUREMENT ARTIFACT (net/http persistConn async teardown vs single-50ms settle) — server is
clean. Fix: settleGoroutines() poll-until-stable + pprof-diff oracle (APP-LEAK vs transport-teardown),
tolerance kept at 4. Review GO/0: anti-mask §1.1 caught an injected delta=1 real leak the coarse check
misses; meta-test intact; -count=3 -race deterministic. Reclassified Bug→test-infra-robustness.
Closure Fixed (§11.4.33). Evidence docs/qa/hxc144_20260712T152500Z/.

Co-Authored-By: Claude Opus 4.8 <noreply@anthropic.com>
</commit_message>
<xml_diff>
--- a/docs/Fixed.docx
+++ b/docs/Fixed.docx
@@ -2,7 +2,7 @@
 <file path=word/document.xml><?xml version="1.0" encoding="utf-8"?>
 <w:document xmlns:w="http://schemas.openxmlformats.org/wordprocessingml/2006/main" xmlns:m="http://schemas.openxmlformats.org/officeDocument/2006/math" xmlns:r="http://schemas.openxmlformats.org/officeDocument/2006/relationships" xmlns:o="urn:schemas-microsoft-com:office:office" xmlns:v="urn:schemas-microsoft-com:vml" xmlns:w10="urn:schemas-microsoft-com:office:word" xmlns:a="http://schemas.openxmlformats.org/drawingml/2006/main" xmlns:pic="http://schemas.openxmlformats.org/drawingml/2006/picture" xmlns:wp="http://schemas.openxmlformats.org/drawingml/2006/wordprocessingDrawing">
   <w:body>
-    <w:bookmarkStart w:id="155" w:name="helixcode-fixed-items-tracker"/>
+    <w:bookmarkStart w:id="156" w:name="helixcode-fixed-items-tracker"/>
     <w:p>
       <w:pPr>
         <w:pStyle w:val="Heading1"/>
@@ -48912,7 +48912,107 @@
       </w:r>
     </w:p>
     <w:bookmarkEnd w:id="154"/>
+    <w:bookmarkStart w:id="155" w:name="Xf7afb59cbef64acf0da7700cc194ddabe925e93"/>
+    <w:p>
+      <w:pPr>
+        <w:pStyle w:val="Heading2"/>
+      </w:pPr>
+      <w:r>
+        <w:t xml:space="preserve">HXC-144 — Server leaks goroutines under sustained DDoS-flood load (chaos test)</w:t>
+      </w:r>
+    </w:p>
+    <w:p>
+      <w:pPr>
+        <w:pStyle w:val="FirstParagraph"/>
+      </w:pPr>
+      <w:r>
+        <w:rPr>
+          <w:b/>
+          <w:bCs/>
+        </w:rPr>
+        <w:t xml:space="preserve">Status:</w:t>
+      </w:r>
+      <w:r>
+        <w:t xml:space="preserve"> </w:t>
+      </w:r>
+      <w:r>
+        <w:t xml:space="preserve">Fixed (→ Fixed.md)</w:t>
+      </w:r>
+      <w:r>
+        <w:t xml:space="preserve"> </w:t>
+      </w:r>
+      <w:r>
+        <w:rPr>
+          <w:b/>
+          <w:bCs/>
+        </w:rPr>
+        <w:t xml:space="preserve">Type:</w:t>
+      </w:r>
+      <w:r>
+        <w:t xml:space="preserve"> </w:t>
+      </w:r>
+      <w:r>
+        <w:t xml:space="preserve">Bug</w:t>
+      </w:r>
+      <w:r>
+        <w:t xml:space="preserve"> </w:t>
+      </w:r>
+      <w:r>
+        <w:rPr>
+          <w:b/>
+          <w:bCs/>
+        </w:rPr>
+        <w:t xml:space="preserve">Evidence:</w:t>
+      </w:r>
+      <w:r>
+        <w:t xml:space="preserve"> </w:t>
+      </w:r>
+      <w:r>
+        <w:t xml:space="preserve">docs/qa/hxc144_20260712T152500Z/EVIDENCE.md</w:t>
+      </w:r>
+      <w:r>
+        <w:t xml:space="preserve"> </w:t>
+      </w:r>
+      <w:r>
+        <w:rPr>
+          <w:b/>
+          <w:bCs/>
+        </w:rPr>
+        <w:t xml:space="preserve">Severity:</w:t>
+      </w:r>
+      <w:r>
+        <w:t xml:space="preserve"> </w:t>
+      </w:r>
+      <w:r>
+        <w:t xml:space="preserve">Medium</w:t>
+      </w:r>
+      <w:r>
+        <w:t xml:space="preserve"> </w:t>
+      </w:r>
+      <w:r>
+        <w:rPr>
+          <w:b/>
+          <w:bCs/>
+        </w:rPr>
+        <w:t xml:space="preserve">Created-By:</w:t>
+      </w:r>
+      <w:r>
+        <w:t xml:space="preserve"> </w:t>
+      </w:r>
+      <w:r>
+        <w:t xml:space="preserve">Claude</w:t>
+      </w:r>
+    </w:p>
+    <w:p>
+      <w:pPr>
+        <w:pStyle w:val="BodyText"/>
+      </w:pPr>
+      <w:r>
+        <w:t xml:space="preserve">Under the sustained request-flood chaos test against the real running server, the goroutine count grew by 5 which exceeds the tolerance of 4, signalling a goroutine leak in a request-handling path when the server is hammered. Left unaddressed this degrades long-running server stability under load. The work is to find the leaking goroutine (likely an unclosed channel, context, or connection in a hot handler) and fix it so the count stays within tolerance under flood. Evidence: docs/qa/infra_retest_20260712_hxc122_138/EVIDENCE.md (Server 7/8).</w:t>
+      </w:r>
+    </w:p>
     <w:bookmarkEnd w:id="155"/>
+    <w:bookmarkEnd w:id="156"/>
     <w:sectPr>
       <w:footnotePr>
         <w:numRestart w:val="eachSect"/>

</xml_diff>

<commit_message>
close(HXC-122): memory+automation now execute against real infra; file HXC-149 (→ Fixed.md)
HXC-122 Completed (§11.4.33): memory suite 15/15 real PASS (infra_retest 168649a4) + automation now
compiles/executes (HXC-142 fixed the no-compile blocker) via the documented real-infra recipe. The
skip-without-server problem is solved; automation runtime defect tracked as HXC-147.
Filed HXC-149 (Bug/Med): stale git gitlink at pre-rename path 'containers' (no .gitmodules map) breaks
git submodule walk — git-index-only reversible fix, deferred until subagent streams quiet.
Gates PASS.

Co-Authored-By: Claude Opus 4.8 <noreply@anthropic.com>
</commit_message>
<xml_diff>
--- a/docs/Fixed.docx
+++ b/docs/Fixed.docx
@@ -2,7 +2,7 @@
 <file path=word/document.xml><?xml version="1.0" encoding="utf-8"?>
 <w:document xmlns:w="http://schemas.openxmlformats.org/wordprocessingml/2006/main" xmlns:m="http://schemas.openxmlformats.org/officeDocument/2006/math" xmlns:r="http://schemas.openxmlformats.org/officeDocument/2006/relationships" xmlns:o="urn:schemas-microsoft-com:office:office" xmlns:v="urn:schemas-microsoft-com:vml" xmlns:w10="urn:schemas-microsoft-com:office:word" xmlns:a="http://schemas.openxmlformats.org/drawingml/2006/main" xmlns:pic="http://schemas.openxmlformats.org/drawingml/2006/picture" xmlns:wp="http://schemas.openxmlformats.org/drawingml/2006/wordprocessingDrawing">
   <w:body>
-    <w:bookmarkStart w:id="156" w:name="helixcode-fixed-items-tracker"/>
+    <w:bookmarkStart w:id="157" w:name="helixcode-fixed-items-tracker"/>
     <w:p>
       <w:pPr>
         <w:pStyle w:val="Heading1"/>
@@ -49012,7 +49012,107 @@
       </w:r>
     </w:p>
     <w:bookmarkEnd w:id="155"/>
+    <w:bookmarkStart w:id="156" w:name="X7168da4de5f2d2c60117a713485cc4d3f54b921"/>
+    <w:p>
+      <w:pPr>
+        <w:pStyle w:val="Heading2"/>
+      </w:pPr>
+      <w:r>
+        <w:t xml:space="preserve">HXC-122 — Memory and automation test suites mostly skip themselves without a running server</w:t>
+      </w:r>
+    </w:p>
+    <w:p>
+      <w:pPr>
+        <w:pStyle w:val="FirstParagraph"/>
+      </w:pPr>
+      <w:r>
+        <w:rPr>
+          <w:b/>
+          <w:bCs/>
+        </w:rPr>
+        <w:t xml:space="preserve">Status:</w:t>
+      </w:r>
+      <w:r>
+        <w:t xml:space="preserve"> </w:t>
+      </w:r>
+      <w:r>
+        <w:t xml:space="preserve">Completed (→ Fixed.md)</w:t>
+      </w:r>
+      <w:r>
+        <w:t xml:space="preserve"> </w:t>
+      </w:r>
+      <w:r>
+        <w:rPr>
+          <w:b/>
+          <w:bCs/>
+        </w:rPr>
+        <w:t xml:space="preserve">Type:</w:t>
+      </w:r>
+      <w:r>
+        <w:t xml:space="preserve"> </w:t>
+      </w:r>
+      <w:r>
+        <w:t xml:space="preserve">Task</w:t>
+      </w:r>
+      <w:r>
+        <w:t xml:space="preserve"> </w:t>
+      </w:r>
+      <w:r>
+        <w:rPr>
+          <w:b/>
+          <w:bCs/>
+        </w:rPr>
+        <w:t xml:space="preserve">Evidence:</w:t>
+      </w:r>
+      <w:r>
+        <w:t xml:space="preserve"> </w:t>
+      </w:r>
+      <w:r>
+        <w:t xml:space="preserve">docs/qa/infra_retest_20260712_hxc122_138/EVIDENCE.md</w:t>
+      </w:r>
+      <w:r>
+        <w:t xml:space="preserve"> </w:t>
+      </w:r>
+      <w:r>
+        <w:rPr>
+          <w:b/>
+          <w:bCs/>
+        </w:rPr>
+        <w:t xml:space="preserve">Severity:</w:t>
+      </w:r>
+      <w:r>
+        <w:t xml:space="preserve"> </w:t>
+      </w:r>
+      <w:r>
+        <w:t xml:space="preserve">Medium</w:t>
+      </w:r>
+      <w:r>
+        <w:t xml:space="preserve"> </w:t>
+      </w:r>
+      <w:r>
+        <w:rPr>
+          <w:b/>
+          <w:bCs/>
+        </w:rPr>
+        <w:t xml:space="preserve">Created-By:</w:t>
+      </w:r>
+      <w:r>
+        <w:t xml:space="preserve"> </w:t>
+      </w:r>
+      <w:r>
+        <w:t xml:space="preserve">Claude</w:t>
+      </w:r>
+    </w:p>
+    <w:p>
+      <w:pPr>
+        <w:pStyle w:val="BodyText"/>
+      </w:pPr>
+      <w:r>
+        <w:t xml:space="preserve">Two categories of tests, memory-usage and end-to-end automation, skip most of their cases by default because they require a live server or special environment flags not set in normal runs. In practice these areas are largely unverified even though the tests appear to exist. The work provides a documented, repeatable way to run them against real infrastructure so they actually execute and prove the behavior. Memory and automation behavior then becomes genuinely tested rather than merely scaffolded.</w:t>
+      </w:r>
+    </w:p>
     <w:bookmarkEnd w:id="156"/>
+    <w:bookmarkEnd w:id="157"/>
     <w:sectPr>
       <w:footnotePr>
         <w:numRestart w:val="eachSect"/>

</xml_diff>

<commit_message>
close(HXC-136,HXC-138): §11.4.40 test-type completion — load/DDoS, scaling, UI/UX real-PASS; file HXC-150 (→ Fixed.md)
HXC-136 Completed: load/DDoS 1700 req 1700x2xx/0x5xx p99=0.283ms zero-leak (5 §1.1 meta-tests pass);
scaling WorkerPool N=1-8 gain 6.93x monotonic; UI/UX TUI+Fyne-headless+CLI-journey PASS (honest §11.4.52
native-pixel SKIP). 17 services healthy rootless podman, other-project containers untouched (§11.4.174),
clean teardown. Evidence docs/qa/infra_retest2_20260712_hxc136/.
HXC-138 Completed: e2e challenge suite ran against real server+model (infra_retest, real LLM calls,
honest 0/6 = 0.5B model quality); the interface-not-driving-server gap is HXC-146 (REST fixed).
Filed HXC-150 (Bug/Low): tests/ddos env-var mismatch causes false SKIP.
Gates PASS.

Co-Authored-By: Claude Opus 4.8 <noreply@anthropic.com>
</commit_message>
<xml_diff>
--- a/docs/Fixed.docx
+++ b/docs/Fixed.docx
@@ -2,7 +2,7 @@
 <file path=word/document.xml><?xml version="1.0" encoding="utf-8"?>
 <w:document xmlns:w="http://schemas.openxmlformats.org/wordprocessingml/2006/main" xmlns:m="http://schemas.openxmlformats.org/officeDocument/2006/math" xmlns:r="http://schemas.openxmlformats.org/officeDocument/2006/relationships" xmlns:o="urn:schemas-microsoft-com:office:office" xmlns:v="urn:schemas-microsoft-com:vml" xmlns:w10="urn:schemas-microsoft-com:office:word" xmlns:a="http://schemas.openxmlformats.org/drawingml/2006/main" xmlns:pic="http://schemas.openxmlformats.org/drawingml/2006/picture" xmlns:wp="http://schemas.openxmlformats.org/drawingml/2006/wordprocessingDrawing">
   <w:body>
-    <w:bookmarkStart w:id="157" w:name="helixcode-fixed-items-tracker"/>
+    <w:bookmarkStart w:id="159" w:name="helixcode-fixed-items-tracker"/>
     <w:p>
       <w:pPr>
         <w:pStyle w:val="Heading1"/>
@@ -49112,7 +49112,207 @@
       </w:r>
     </w:p>
     <w:bookmarkEnd w:id="156"/>
+    <w:bookmarkStart w:id="157" w:name="X14cf2054f0d6232efe903a1c4542755a8432c0d"/>
+    <w:p>
+      <w:pPr>
+        <w:pStyle w:val="Heading2"/>
+      </w:pPr>
+      <w:r>
+        <w:t xml:space="preserve">HXC-136 — Verify the remaining automated test types run with real captured evidence</w:t>
+      </w:r>
+    </w:p>
+    <w:p>
+      <w:pPr>
+        <w:pStyle w:val="FirstParagraph"/>
+      </w:pPr>
+      <w:r>
+        <w:rPr>
+          <w:b/>
+          <w:bCs/>
+        </w:rPr>
+        <w:t xml:space="preserve">Status:</w:t>
+      </w:r>
+      <w:r>
+        <w:t xml:space="preserve"> </w:t>
+      </w:r>
+      <w:r>
+        <w:t xml:space="preserve">Completed (→ Fixed.md)</w:t>
+      </w:r>
+      <w:r>
+        <w:t xml:space="preserve"> </w:t>
+      </w:r>
+      <w:r>
+        <w:rPr>
+          <w:b/>
+          <w:bCs/>
+        </w:rPr>
+        <w:t xml:space="preserve">Type:</w:t>
+      </w:r>
+      <w:r>
+        <w:t xml:space="preserve"> </w:t>
+      </w:r>
+      <w:r>
+        <w:t xml:space="preserve">Task</w:t>
+      </w:r>
+      <w:r>
+        <w:t xml:space="preserve"> </w:t>
+      </w:r>
+      <w:r>
+        <w:rPr>
+          <w:b/>
+          <w:bCs/>
+        </w:rPr>
+        <w:t xml:space="preserve">Evidence:</w:t>
+      </w:r>
+      <w:r>
+        <w:t xml:space="preserve"> </w:t>
+      </w:r>
+      <w:r>
+        <w:t xml:space="preserve">docs/qa/infra_retest2_20260712_hxc136/EVIDENCE.md</w:t>
+      </w:r>
+      <w:r>
+        <w:t xml:space="preserve"> </w:t>
+      </w:r>
+      <w:r>
+        <w:rPr>
+          <w:b/>
+          <w:bCs/>
+        </w:rPr>
+        <w:t xml:space="preserve">Severity:</w:t>
+      </w:r>
+      <w:r>
+        <w:t xml:space="preserve"> </w:t>
+      </w:r>
+      <w:r>
+        <w:t xml:space="preserve">Medium</w:t>
+      </w:r>
+      <w:r>
+        <w:t xml:space="preserve"> </w:t>
+      </w:r>
+      <w:r>
+        <w:rPr>
+          <w:b/>
+          <w:bCs/>
+        </w:rPr>
+        <w:t xml:space="preserve">Created-By:</w:t>
+      </w:r>
+      <w:r>
+        <w:t xml:space="preserve"> </w:t>
+      </w:r>
+      <w:r>
+        <w:t xml:space="preserve">Claude</w:t>
+      </w:r>
+    </w:p>
+    <w:p>
+      <w:pPr>
+        <w:pStyle w:val="BodyText"/>
+      </w:pPr>
+      <w:r>
+        <w:t xml:space="preserve">Several mandated automated test categories — load/denial-of-service, scaling, stress and chaos, and user-interface/experience — were not exercised in the latest real-infrastructure run, so their current health is unconfirmed. The work is to run each of these test types against real infrastructure and capture proof of the results. This completes the promised full test-type coverage and confirms the product holds up under load and adverse conditions.</w:t>
+      </w:r>
+    </w:p>
     <w:bookmarkEnd w:id="157"/>
+    <w:bookmarkStart w:id="158" w:name="Xe5c0b9484c2706131a5e705eca910482f01e090"/>
+    <w:p>
+      <w:pPr>
+        <w:pStyle w:val="Heading2"/>
+      </w:pPr>
+      <w:r>
+        <w:t xml:space="preserve">HXC-138 — Run the end-to-end challenge suite against a running server</w:t>
+      </w:r>
+    </w:p>
+    <w:p>
+      <w:pPr>
+        <w:pStyle w:val="FirstParagraph"/>
+      </w:pPr>
+      <w:r>
+        <w:rPr>
+          <w:b/>
+          <w:bCs/>
+        </w:rPr>
+        <w:t xml:space="preserve">Status:</w:t>
+      </w:r>
+      <w:r>
+        <w:t xml:space="preserve"> </w:t>
+      </w:r>
+      <w:r>
+        <w:t xml:space="preserve">Completed (→ Fixed.md)</w:t>
+      </w:r>
+      <w:r>
+        <w:t xml:space="preserve"> </w:t>
+      </w:r>
+      <w:r>
+        <w:rPr>
+          <w:b/>
+          <w:bCs/>
+        </w:rPr>
+        <w:t xml:space="preserve">Type:</w:t>
+      </w:r>
+      <w:r>
+        <w:t xml:space="preserve"> </w:t>
+      </w:r>
+      <w:r>
+        <w:t xml:space="preserve">Task</w:t>
+      </w:r>
+      <w:r>
+        <w:t xml:space="preserve"> </w:t>
+      </w:r>
+      <w:r>
+        <w:rPr>
+          <w:b/>
+          <w:bCs/>
+        </w:rPr>
+        <w:t xml:space="preserve">Evidence:</w:t>
+      </w:r>
+      <w:r>
+        <w:t xml:space="preserve"> </w:t>
+      </w:r>
+      <w:r>
+        <w:t xml:space="preserve">docs/qa/infra_retest_20260712_hxc122_138/EVIDENCE.md</w:t>
+      </w:r>
+      <w:r>
+        <w:t xml:space="preserve"> </w:t>
+      </w:r>
+      <w:r>
+        <w:rPr>
+          <w:b/>
+          <w:bCs/>
+        </w:rPr>
+        <w:t xml:space="preserve">Severity:</w:t>
+      </w:r>
+      <w:r>
+        <w:t xml:space="preserve"> </w:t>
+      </w:r>
+      <w:r>
+        <w:t xml:space="preserve">Low</w:t>
+      </w:r>
+      <w:r>
+        <w:t xml:space="preserve"> </w:t>
+      </w:r>
+      <w:r>
+        <w:rPr>
+          <w:b/>
+          <w:bCs/>
+        </w:rPr>
+        <w:t xml:space="preserve">Created-By:</w:t>
+      </w:r>
+      <w:r>
+        <w:t xml:space="preserve"> </w:t>
+      </w:r>
+      <w:r>
+        <w:t xml:space="preserve">Claude</w:t>
+      </w:r>
+    </w:p>
+    <w:p>
+      <w:pPr>
+        <w:pStyle w:val="BodyText"/>
+      </w:pPr>
+      <w:r>
+        <w:t xml:space="preserve">The end-to-end challenge runner can now launch all its scenarios (a missing option was just fixed), but the scenarios still need to be executed against a live server with a real model to confirm the complete user journeys work. The work is to stand up a server and run the challenges, capturing the results. This provides real proof that the headline user workflows function end to end.</w:t>
+      </w:r>
+    </w:p>
+    <w:bookmarkEnd w:id="158"/>
+    <w:bookmarkEnd w:id="159"/>
     <w:sectPr>
       <w:footnotePr>
         <w:numRestart w:val="eachSect"/>

</xml_diff>

<commit_message>
close(HXC-150): align tests/ddos env vars with .env.full-test (→ Fixed.md)
Source eefe78a2: envOrHelix/envOrIntHelix helpers read HELIX_DATABASE_*/HELIX_REDIS_* first,
fall back to legacy TEST_* vars, then hardcoded defaults matching .env.full-test. 6 unit tests
prove the 3-tier fallback. Suite now executes out of the box under make test-infra-up.
Closure Fixed (§11.4.33, Bug). Evidence docs/qa/hxc150_20260712T172000Z/.

Co-Authored-By: Claude Opus 4.8 <noreply@anthropic.com>
</commit_message>
<xml_diff>
--- a/docs/Fixed.docx
+++ b/docs/Fixed.docx
@@ -2,7 +2,7 @@
 <file path=word/document.xml><?xml version="1.0" encoding="utf-8"?>
 <w:document xmlns:w="http://schemas.openxmlformats.org/wordprocessingml/2006/main" xmlns:m="http://schemas.openxmlformats.org/officeDocument/2006/math" xmlns:r="http://schemas.openxmlformats.org/officeDocument/2006/relationships" xmlns:o="urn:schemas-microsoft-com:office:office" xmlns:v="urn:schemas-microsoft-com:vml" xmlns:w10="urn:schemas-microsoft-com:office:word" xmlns:a="http://schemas.openxmlformats.org/drawingml/2006/main" xmlns:pic="http://schemas.openxmlformats.org/drawingml/2006/picture" xmlns:wp="http://schemas.openxmlformats.org/drawingml/2006/wordprocessingDrawing">
   <w:body>
-    <w:bookmarkStart w:id="159" w:name="helixcode-fixed-items-tracker"/>
+    <w:bookmarkStart w:id="160" w:name="helixcode-fixed-items-tracker"/>
     <w:p>
       <w:pPr>
         <w:pStyle w:val="Heading1"/>
@@ -49312,7 +49312,107 @@
       </w:r>
     </w:p>
     <w:bookmarkEnd w:id="158"/>
+    <w:bookmarkStart w:id="159" w:name="Xdea3912bfc0de0ae455e3900f8c216bb5b0d800"/>
+    <w:p>
+      <w:pPr>
+        <w:pStyle w:val="Heading2"/>
+      </w:pPr>
+      <w:r>
+        <w:t xml:space="preserve">HXC-150 — tests/ddos env-var names (TEST_PG_/TEST_REDIS_) mismatch .env.full-test causing false SKIP</w:t>
+      </w:r>
+    </w:p>
+    <w:p>
+      <w:pPr>
+        <w:pStyle w:val="FirstParagraph"/>
+      </w:pPr>
+      <w:r>
+        <w:rPr>
+          <w:b/>
+          <w:bCs/>
+        </w:rPr>
+        <w:t xml:space="preserve">Status:</w:t>
+      </w:r>
+      <w:r>
+        <w:t xml:space="preserve"> </w:t>
+      </w:r>
+      <w:r>
+        <w:t xml:space="preserve">Fixed (→ Fixed.md)</w:t>
+      </w:r>
+      <w:r>
+        <w:t xml:space="preserve"> </w:t>
+      </w:r>
+      <w:r>
+        <w:rPr>
+          <w:b/>
+          <w:bCs/>
+        </w:rPr>
+        <w:t xml:space="preserve">Type:</w:t>
+      </w:r>
+      <w:r>
+        <w:t xml:space="preserve"> </w:t>
+      </w:r>
+      <w:r>
+        <w:t xml:space="preserve">Bug</w:t>
+      </w:r>
+      <w:r>
+        <w:t xml:space="preserve"> </w:t>
+      </w:r>
+      <w:r>
+        <w:rPr>
+          <w:b/>
+          <w:bCs/>
+        </w:rPr>
+        <w:t xml:space="preserve">Evidence:</w:t>
+      </w:r>
+      <w:r>
+        <w:t xml:space="preserve"> </w:t>
+      </w:r>
+      <w:r>
+        <w:t xml:space="preserve">docs/qa/hxc150_20260712T172000Z/EVIDENCE.md</w:t>
+      </w:r>
+      <w:r>
+        <w:t xml:space="preserve"> </w:t>
+      </w:r>
+      <w:r>
+        <w:rPr>
+          <w:b/>
+          <w:bCs/>
+        </w:rPr>
+        <w:t xml:space="preserve">Severity:</w:t>
+      </w:r>
+      <w:r>
+        <w:t xml:space="preserve"> </w:t>
+      </w:r>
+      <w:r>
+        <w:t xml:space="preserve">Low</w:t>
+      </w:r>
+      <w:r>
+        <w:t xml:space="preserve"> </w:t>
+      </w:r>
+      <w:r>
+        <w:rPr>
+          <w:b/>
+          <w:bCs/>
+        </w:rPr>
+        <w:t xml:space="preserve">Created-By:</w:t>
+      </w:r>
+      <w:r>
+        <w:t xml:space="preserve"> </w:t>
+      </w:r>
+      <w:r>
+        <w:t xml:space="preserve">Claude</w:t>
+      </w:r>
+    </w:p>
+    <w:p>
+      <w:pPr>
+        <w:pStyle w:val="BodyText"/>
+      </w:pPr>
+      <w:r>
+        <w:t xml:space="preserve">The load/DDoS test harness (tests/ddos, -tags=integration) reads TEST_PG_* and TEST_REDIS_* environment variables to reach the real Postgres and Redis, but the projects .env.full-test only exports HELIX_DATABASE_* and HELIX_REDIS_*, and the defaults do not match the container credentials. So under the normal make test-load-full workflow the suite falsely SKIPs even when infra is fully healthy (it only ran once the correct credentials were passed manually during the 2026-07-12 retest). The work is to align the harness env-var names/defaults with .env.full-test so load/DDoS executes out of the box. Low severity, test-harness only.</w:t>
+      </w:r>
+    </w:p>
     <w:bookmarkEnd w:id="159"/>
+    <w:bookmarkEnd w:id="160"/>
     <w:sectPr>
       <w:footnotePr>
         <w:numRestart w:val="eachSect"/>

</xml_diff>

<commit_message>
close(HXC-148): wire RAG into OpenAI/Anthropic compat endpoints (→ Fixed.md)
Source 6efadd15: applyRAGContext in chatCompletions + anthropicMessages. 4 guard tests PASS.
Closure Fixed (§11.4.33, Task). Evidence docs/qa/hxc148_20260712T173000Z/.

Co-Authored-By: Claude Opus 4.8 <noreply@anthropic.com>
</commit_message>
<xml_diff>
--- a/docs/Fixed.docx
+++ b/docs/Fixed.docx
@@ -2,7 +2,7 @@
 <file path=word/document.xml><?xml version="1.0" encoding="utf-8"?>
 <w:document xmlns:w="http://schemas.openxmlformats.org/wordprocessingml/2006/main" xmlns:m="http://schemas.openxmlformats.org/officeDocument/2006/math" xmlns:r="http://schemas.openxmlformats.org/officeDocument/2006/relationships" xmlns:o="urn:schemas-microsoft-com:office:office" xmlns:v="urn:schemas-microsoft-com:vml" xmlns:w10="urn:schemas-microsoft-com:office:word" xmlns:a="http://schemas.openxmlformats.org/drawingml/2006/main" xmlns:pic="http://schemas.openxmlformats.org/drawingml/2006/picture" xmlns:wp="http://schemas.openxmlformats.org/drawingml/2006/wordprocessingDrawing">
   <w:body>
-    <w:bookmarkStart w:id="160" w:name="helixcode-fixed-items-tracker"/>
+    <w:bookmarkStart w:id="161" w:name="helixcode-fixed-items-tracker"/>
     <w:p>
       <w:pPr>
         <w:pStyle w:val="Heading1"/>
@@ -49412,7 +49412,107 @@
       </w:r>
     </w:p>
     <w:bookmarkEnd w:id="159"/>
+    <w:bookmarkStart w:id="160" w:name="X609feba332ca6b94d16f2875935a670ea2c4d36"/>
+    <w:p>
+      <w:pPr>
+        <w:pStyle w:val="Heading2"/>
+      </w:pPr>
+      <w:r>
+        <w:t xml:space="preserve">HXC-148 — Wire RAG retrieval-augmentation into the OpenAI/Anthropic wire-facade endpoints</w:t>
+      </w:r>
+    </w:p>
+    <w:p>
+      <w:pPr>
+        <w:pStyle w:val="FirstParagraph"/>
+      </w:pPr>
+      <w:r>
+        <w:rPr>
+          <w:b/>
+          <w:bCs/>
+        </w:rPr>
+        <w:t xml:space="preserve">Status:</w:t>
+      </w:r>
+      <w:r>
+        <w:t xml:space="preserve"> </w:t>
+      </w:r>
+      <w:r>
+        <w:t xml:space="preserve">Fixed (→ Fixed.md)</w:t>
+      </w:r>
+      <w:r>
+        <w:t xml:space="preserve"> </w:t>
+      </w:r>
+      <w:r>
+        <w:rPr>
+          <w:b/>
+          <w:bCs/>
+        </w:rPr>
+        <w:t xml:space="preserve">Type:</w:t>
+      </w:r>
+      <w:r>
+        <w:t xml:space="preserve"> </w:t>
+      </w:r>
+      <w:r>
+        <w:t xml:space="preserve">Task</w:t>
+      </w:r>
+      <w:r>
+        <w:t xml:space="preserve"> </w:t>
+      </w:r>
+      <w:r>
+        <w:rPr>
+          <w:b/>
+          <w:bCs/>
+        </w:rPr>
+        <w:t xml:space="preserve">Evidence:</w:t>
+      </w:r>
+      <w:r>
+        <w:t xml:space="preserve"> </w:t>
+      </w:r>
+      <w:r>
+        <w:t xml:space="preserve">docs/qa/hxc148_20260712T173000Z/EVIDENCE.md</w:t>
+      </w:r>
+      <w:r>
+        <w:t xml:space="preserve"> </w:t>
+      </w:r>
+      <w:r>
+        <w:rPr>
+          <w:b/>
+          <w:bCs/>
+        </w:rPr>
+        <w:t xml:space="preserve">Severity:</w:t>
+      </w:r>
+      <w:r>
+        <w:t xml:space="preserve"> </w:t>
+      </w:r>
+      <w:r>
+        <w:t xml:space="preserve">Low</w:t>
+      </w:r>
+      <w:r>
+        <w:t xml:space="preserve"> </w:t>
+      </w:r>
+      <w:r>
+        <w:rPr>
+          <w:b/>
+          <w:bCs/>
+        </w:rPr>
+        <w:t xml:space="preserve">Created-By:</w:t>
+      </w:r>
+      <w:r>
+        <w:t xml:space="preserve"> </w:t>
+      </w:r>
+      <w:r>
+        <w:t xml:space="preserve">Claude</w:t>
+      </w:r>
+    </w:p>
+    <w:p>
+      <w:pPr>
+        <w:pStyle w:val="BodyText"/>
+      </w:pPr>
+      <w:r>
+        <w:t xml:space="preserve">HXC-118 wired Retrieval-Augmented-Generation into the native server generate and stream endpoints and the CLI, but the OpenAI-compatible and Anthropic-compatible wire-facade endpoints (/v1/chat/completions and /v1/messages) still bypass RAG entirely, so clients using those compatibility surfaces do not get retrieval-augmentation even when it is enabled. The work is to apply the same applyRAGContext wiring to those facade handlers so RAG behaves consistently across every generate surface. This is a smaller secondary surface than the native path already fixed. Found during HXC-118 review 2026-07-12.</w:t>
+      </w:r>
+    </w:p>
     <w:bookmarkEnd w:id="160"/>
+    <w:bookmarkEnd w:id="161"/>
     <w:sectPr>
       <w:footnotePr>
         <w:numRestart w:val="eachSect"/>

</xml_diff>

<commit_message>
close(HXC-149): stale gitlinks breaking submodule walk (→ Fixed.md)
Source ac75ee4a: 67 stale gitlinks removed (git-index-only). Closure Fixed (§11.4.33, Bug).
Evidence docs/qa/hxc149_20260712T173500Z/.

Co-Authored-By: Claude Opus 4.8 <noreply@anthropic.com>
</commit_message>
<xml_diff>
--- a/docs/Fixed.docx
+++ b/docs/Fixed.docx
@@ -2,7 +2,7 @@
 <file path=word/document.xml><?xml version="1.0" encoding="utf-8"?>
 <w:document xmlns:w="http://schemas.openxmlformats.org/wordprocessingml/2006/main" xmlns:m="http://schemas.openxmlformats.org/officeDocument/2006/math" xmlns:r="http://schemas.openxmlformats.org/officeDocument/2006/relationships" xmlns:o="urn:schemas-microsoft-com:office:office" xmlns:v="urn:schemas-microsoft-com:vml" xmlns:w10="urn:schemas-microsoft-com:office:word" xmlns:a="http://schemas.openxmlformats.org/drawingml/2006/main" xmlns:pic="http://schemas.openxmlformats.org/drawingml/2006/picture" xmlns:wp="http://schemas.openxmlformats.org/drawingml/2006/wordprocessingDrawing">
   <w:body>
-    <w:bookmarkStart w:id="161" w:name="helixcode-fixed-items-tracker"/>
+    <w:bookmarkStart w:id="162" w:name="helixcode-fixed-items-tracker"/>
     <w:p>
       <w:pPr>
         <w:pStyle w:val="Heading1"/>
@@ -49512,7 +49512,117 @@
       </w:r>
     </w:p>
     <w:bookmarkEnd w:id="160"/>
+    <w:bookmarkStart w:id="161" w:name="X1bfa01b20f2031679f4f158332873cc0a994d24"/>
+    <w:p>
+      <w:pPr>
+        <w:pStyle w:val="Heading2"/>
+      </w:pPr>
+      <w:r>
+        <w:t xml:space="preserve">HXC-149 — Stale git gitlink at pre-rename path containers breaks git submodule walk</w:t>
+      </w:r>
+    </w:p>
+    <w:p>
+      <w:pPr>
+        <w:pStyle w:val="FirstParagraph"/>
+      </w:pPr>
+      <w:r>
+        <w:rPr>
+          <w:b/>
+          <w:bCs/>
+        </w:rPr>
+        <w:t xml:space="preserve">Status:</w:t>
+      </w:r>
+      <w:r>
+        <w:t xml:space="preserve"> </w:t>
+      </w:r>
+      <w:r>
+        <w:t xml:space="preserve">Fixed (→ Fixed.md)</w:t>
+      </w:r>
+      <w:r>
+        <w:t xml:space="preserve"> </w:t>
+      </w:r>
+      <w:r>
+        <w:rPr>
+          <w:b/>
+          <w:bCs/>
+        </w:rPr>
+        <w:t xml:space="preserve">Type:</w:t>
+      </w:r>
+      <w:r>
+        <w:t xml:space="preserve"> </w:t>
+      </w:r>
+      <w:r>
+        <w:t xml:space="preserve">Bug</w:t>
+      </w:r>
+      <w:r>
+        <w:t xml:space="preserve"> </w:t>
+      </w:r>
+      <w:r>
+        <w:rPr>
+          <w:b/>
+          <w:bCs/>
+        </w:rPr>
+        <w:t xml:space="preserve">Evidence:</w:t>
+      </w:r>
+      <w:r>
+        <w:t xml:space="preserve"> </w:t>
+      </w:r>
+      <w:r>
+        <w:t xml:space="preserve">docs/qa/hxc149_20260712T173500Z/EVIDENCE.md</w:t>
+      </w:r>
+      <w:r>
+        <w:t xml:space="preserve"> </w:t>
+      </w:r>
+      <w:r>
+        <w:rPr>
+          <w:b/>
+          <w:bCs/>
+        </w:rPr>
+        <w:t xml:space="preserve">Severity:</w:t>
+      </w:r>
+      <w:r>
+        <w:t xml:space="preserve"> </w:t>
+      </w:r>
+      <w:r>
+        <w:t xml:space="preserve">Medium</w:t>
+      </w:r>
+      <w:r>
+        <w:t xml:space="preserve"> </w:t>
+      </w:r>
+      <w:r>
+        <w:rPr>
+          <w:b/>
+          <w:bCs/>
+        </w:rPr>
+        <w:t xml:space="preserve">Created-By:</w:t>
+      </w:r>
+      <w:r>
+        <w:t xml:space="preserve"> </w:t>
+      </w:r>
+      <w:r>
+        <w:t xml:space="preserve">Claude</w:t>
+      </w:r>
+    </w:p>
+    <w:p>
+      <w:pPr>
+        <w:pStyle w:val="BodyText"/>
+      </w:pPr>
+      <w:r>
+        <w:t xml:space="preserve">The main repository git index carries approximately 70 stale submodule gitlinks at pre-rename paths (dependencies/HelixDevelopment/</w:t>
+      </w:r>
+      <w:r>
+        <w:rPr>
+          <w:i/>
+          <w:iCs/>
+        </w:rPr>
+        <w:t xml:space="preserve">, dependencies/vasic-digital/</w:t>
+      </w:r>
+      <w:r>
+        <w:t xml:space="preserve">, and top-level helix_agent/helix_qa/panoptic/security) with no .gitmodules mapping, left over from a historical path-rename to the submodules/ layout. As a result git submodule status and git submodule foreach abort mid-walk with no submodule mapping found in .gitmodules for path …, so any release or maintenance script that walks all submodules unfiltered fails partway. The work is to remove ALL stale cached gitlinks (git rm –cached on each) so the submodule set is consistent with .gitmodules and submodule-walking tooling completes. This is a git-index-only change, reversible via git reset. Found by the 2026-07-12 release-readiness survey. Low runtime risk but blocks release automation.</w:t>
+      </w:r>
+    </w:p>
     <w:bookmarkEnd w:id="161"/>
+    <w:bookmarkEnd w:id="162"/>
     <w:sectPr>
       <w:footnotePr>
         <w:numRestart w:val="eachSect"/>

</xml_diff>

<commit_message>
close(HXC-145,HXC-147): stale model-ids + nil-deref hardening (→ Fixed.md)
Source 0e3bb747. Closure Fixed (§11.4.33, Bug). Evidence docs/qa/hxc145_147_20260712T190000Z/.
Gates PASS. Queue: 2 (HXC-119, HXC-146).

Co-Authored-By: Claude Opus 4.8 <noreply@anthropic.com>
</commit_message>
<xml_diff>
--- a/docs/Fixed.docx
+++ b/docs/Fixed.docx
@@ -2,7 +2,7 @@
 <file path=word/document.xml><?xml version="1.0" encoding="utf-8"?>
 <w:document xmlns:w="http://schemas.openxmlformats.org/wordprocessingml/2006/main" xmlns:m="http://schemas.openxmlformats.org/officeDocument/2006/math" xmlns:r="http://schemas.openxmlformats.org/officeDocument/2006/relationships" xmlns:o="urn:schemas-microsoft-com:office:office" xmlns:v="urn:schemas-microsoft-com:vml" xmlns:w10="urn:schemas-microsoft-com:office:word" xmlns:a="http://schemas.openxmlformats.org/drawingml/2006/main" xmlns:pic="http://schemas.openxmlformats.org/drawingml/2006/picture" xmlns:wp="http://schemas.openxmlformats.org/drawingml/2006/wordprocessingDrawing">
   <w:body>
-    <w:bookmarkStart w:id="162" w:name="helixcode-fixed-items-tracker"/>
+    <w:bookmarkStart w:id="164" w:name="helixcode-fixed-items-tracker"/>
     <w:p>
       <w:pPr>
         <w:pStyle w:val="Heading1"/>
@@ -49622,7 +49622,207 @@
       </w:r>
     </w:p>
     <w:bookmarkEnd w:id="161"/>
+    <w:bookmarkStart w:id="162" w:name="X5cd0de2ff8245a6eb254a3c9edeabbe6d1f4b1d"/>
+    <w:p>
+      <w:pPr>
+        <w:pStyle w:val="Heading2"/>
+      </w:pPr>
+      <w:r>
+        <w:t xml:space="preserve">HXC-145 — Configured Xiaomi model mimo-v2-flash is rejected by the real Xiaomi API</w:t>
+      </w:r>
+    </w:p>
+    <w:p>
+      <w:pPr>
+        <w:pStyle w:val="FirstParagraph"/>
+      </w:pPr>
+      <w:r>
+        <w:rPr>
+          <w:b/>
+          <w:bCs/>
+        </w:rPr>
+        <w:t xml:space="preserve">Status:</w:t>
+      </w:r>
+      <w:r>
+        <w:t xml:space="preserve"> </w:t>
+      </w:r>
+      <w:r>
+        <w:t xml:space="preserve">Fixed (→ Fixed.md)</w:t>
+      </w:r>
+      <w:r>
+        <w:t xml:space="preserve"> </w:t>
+      </w:r>
+      <w:r>
+        <w:rPr>
+          <w:b/>
+          <w:bCs/>
+        </w:rPr>
+        <w:t xml:space="preserve">Type:</w:t>
+      </w:r>
+      <w:r>
+        <w:t xml:space="preserve"> </w:t>
+      </w:r>
+      <w:r>
+        <w:t xml:space="preserve">Bug</w:t>
+      </w:r>
+      <w:r>
+        <w:t xml:space="preserve"> </w:t>
+      </w:r>
+      <w:r>
+        <w:rPr>
+          <w:b/>
+          <w:bCs/>
+        </w:rPr>
+        <w:t xml:space="preserve">Evidence:</w:t>
+      </w:r>
+      <w:r>
+        <w:t xml:space="preserve"> </w:t>
+      </w:r>
+      <w:r>
+        <w:t xml:space="preserve">docs/qa/hxc145_147_20260712T190000Z/EVIDENCE.md</w:t>
+      </w:r>
+      <w:r>
+        <w:t xml:space="preserve"> </w:t>
+      </w:r>
+      <w:r>
+        <w:rPr>
+          <w:b/>
+          <w:bCs/>
+        </w:rPr>
+        <w:t xml:space="preserve">Severity:</w:t>
+      </w:r>
+      <w:r>
+        <w:t xml:space="preserve"> </w:t>
+      </w:r>
+      <w:r>
+        <w:t xml:space="preserve">Low</w:t>
+      </w:r>
+      <w:r>
+        <w:t xml:space="preserve"> </w:t>
+      </w:r>
+      <w:r>
+        <w:rPr>
+          <w:b/>
+          <w:bCs/>
+        </w:rPr>
+        <w:t xml:space="preserve">Created-By:</w:t>
+      </w:r>
+      <w:r>
+        <w:t xml:space="preserve"> </w:t>
+      </w:r>
+      <w:r>
+        <w:t xml:space="preserve">Claude</w:t>
+      </w:r>
+    </w:p>
+    <w:p>
+      <w:pPr>
+        <w:pStyle w:val="BodyText"/>
+      </w:pPr>
+      <w:r>
+        <w:t xml:space="preserve">During the real-infra retest the Xiaomi provider chaos tests failed 2 of 5 because the model id configured for Xiaomi (mimo-v2-flash) is rejected by the live Xiaomi API, indicating the configured model name is stale or wrong. Users selecting the Xiaomi provider with that model would get errors. The work is to determine the correct current Xiaomi model id (from the provider or the verifier as single source of truth) and update the configuration so Xiaomi requests succeed. Evidence: docs/qa/infra_retest_20260712_hxc122_138/EVIDENCE.md (Xiaomi 3/5).</w:t>
+      </w:r>
+    </w:p>
     <w:bookmarkEnd w:id="162"/>
+    <w:bookmarkStart w:id="163" w:name="X4f8444fe8b182f00b17120899bac2253f4208db"/>
+    <w:p>
+      <w:pPr>
+        <w:pStyle w:val="Heading2"/>
+      </w:pPr>
+      <w:r>
+        <w:t xml:space="preserve">HXC-147 — OpenRouter provider automation test nil-pointer panics on stale model deepseek-r1-free</w:t>
+      </w:r>
+    </w:p>
+    <w:p>
+      <w:pPr>
+        <w:pStyle w:val="FirstParagraph"/>
+      </w:pPr>
+      <w:r>
+        <w:rPr>
+          <w:b/>
+          <w:bCs/>
+        </w:rPr>
+        <w:t xml:space="preserve">Status:</w:t>
+      </w:r>
+      <w:r>
+        <w:t xml:space="preserve"> </w:t>
+      </w:r>
+      <w:r>
+        <w:t xml:space="preserve">Fixed (→ Fixed.md)</w:t>
+      </w:r>
+      <w:r>
+        <w:t xml:space="preserve"> </w:t>
+      </w:r>
+      <w:r>
+        <w:rPr>
+          <w:b/>
+          <w:bCs/>
+        </w:rPr>
+        <w:t xml:space="preserve">Type:</w:t>
+      </w:r>
+      <w:r>
+        <w:t xml:space="preserve"> </w:t>
+      </w:r>
+      <w:r>
+        <w:t xml:space="preserve">Bug</w:t>
+      </w:r>
+      <w:r>
+        <w:t xml:space="preserve"> </w:t>
+      </w:r>
+      <w:r>
+        <w:rPr>
+          <w:b/>
+          <w:bCs/>
+        </w:rPr>
+        <w:t xml:space="preserve">Evidence:</w:t>
+      </w:r>
+      <w:r>
+        <w:t xml:space="preserve"> </w:t>
+      </w:r>
+      <w:r>
+        <w:t xml:space="preserve">docs/qa/hxc145_147_20260712T190000Z/EVIDENCE.md</w:t>
+      </w:r>
+      <w:r>
+        <w:t xml:space="preserve"> </w:t>
+      </w:r>
+      <w:r>
+        <w:rPr>
+          <w:b/>
+          <w:bCs/>
+        </w:rPr>
+        <w:t xml:space="preserve">Severity:</w:t>
+      </w:r>
+      <w:r>
+        <w:t xml:space="preserve"> </w:t>
+      </w:r>
+      <w:r>
+        <w:t xml:space="preserve">Medium</w:t>
+      </w:r>
+      <w:r>
+        <w:t xml:space="preserve"> </w:t>
+      </w:r>
+      <w:r>
+        <w:rPr>
+          <w:b/>
+          <w:bCs/>
+        </w:rPr>
+        <w:t xml:space="preserve">Created-By:</w:t>
+      </w:r>
+      <w:r>
+        <w:t xml:space="preserve"> </w:t>
+      </w:r>
+      <w:r>
+        <w:t xml:space="preserve">Claude</w:t>
+      </w:r>
+    </w:p>
+    <w:p>
+      <w:pPr>
+        <w:pStyle w:val="BodyText"/>
+      </w:pPr>
+      <w:r>
+        <w:t xml:space="preserve">Running the (now-compilable) automation test binary against the live OpenRouter API, TestAllFreeProvidersAutomation Provider_OpenRouter BasicGeneration panics with a nil-pointer dereference: the configured free model id deepseek-r1-free is stale/rejected and the code path is missing a nil-check on the error before using the response. Users of the OpenRouter free provider with that model would hit the same crash. The work is to correct the free-provider model id (sourced from the verifier as single source of truth) and add the missing nil-check so a rejected model degrades gracefully instead of panicking. NOTE this environment has live provider API keys set so provider tests spend real money; guard/skip accordingly. Found 2026-07-12.</w:t>
+      </w:r>
+    </w:p>
+    <w:bookmarkEnd w:id="163"/>
+    <w:bookmarkEnd w:id="164"/>
     <w:sectPr>
       <w:footnotePr>
         <w:numRestart w:val="eachSect"/>

</xml_diff>

<commit_message>
close(HXC-146): challenge-runner REST interface drives real server API (→ Fixed.md)
Source e5adc0fc. Closure Fixed (§11.4.33, Task). Evidence docs/qa/hxc146_20260712T191000Z/.
Gates PASS. Queue: 1 (HXC-119 only).

Co-Authored-By: Claude Opus 4.8 <noreply@anthropic.com>
</commit_message>
<xml_diff>
--- a/docs/Fixed.docx
+++ b/docs/Fixed.docx
@@ -2,7 +2,7 @@
 <file path=word/document.xml><?xml version="1.0" encoding="utf-8"?>
 <w:document xmlns:w="http://schemas.openxmlformats.org/wordprocessingml/2006/main" xmlns:m="http://schemas.openxmlformats.org/officeDocument/2006/math" xmlns:r="http://schemas.openxmlformats.org/officeDocument/2006/relationships" xmlns:o="urn:schemas-microsoft-com:office:office" xmlns:v="urn:schemas-microsoft-com:vml" xmlns:w10="urn:schemas-microsoft-com:office:word" xmlns:a="http://schemas.openxmlformats.org/drawingml/2006/main" xmlns:pic="http://schemas.openxmlformats.org/drawingml/2006/picture" xmlns:wp="http://schemas.openxmlformats.org/drawingml/2006/wordprocessingDrawing">
   <w:body>
-    <w:bookmarkStart w:id="164" w:name="helixcode-fixed-items-tracker"/>
+    <w:bookmarkStart w:id="165" w:name="helixcode-fixed-items-tracker"/>
     <w:p>
       <w:pPr>
         <w:pStyle w:val="Heading1"/>
@@ -49822,7 +49822,107 @@
       </w:r>
     </w:p>
     <w:bookmarkEnd w:id="163"/>
+    <w:bookmarkStart w:id="164" w:name="X1e6955bfb01c2f30828a0de030cdb79ef273697"/>
+    <w:p>
+      <w:pPr>
+        <w:pStyle w:val="Heading2"/>
+      </w:pPr>
+      <w:r>
+        <w:t xml:space="preserve">HXC-146 — E2E challenge runner interfaces (cli/rest/tui/websocket) do not drive the real server HTTP API</w:t>
+      </w:r>
+    </w:p>
+    <w:p>
+      <w:pPr>
+        <w:pStyle w:val="FirstParagraph"/>
+      </w:pPr>
+      <w:r>
+        <w:rPr>
+          <w:b/>
+          <w:bCs/>
+        </w:rPr>
+        <w:t xml:space="preserve">Status:</w:t>
+      </w:r>
+      <w:r>
+        <w:t xml:space="preserve"> </w:t>
+      </w:r>
+      <w:r>
+        <w:t xml:space="preserve">Fixed (→ Fixed.md)</w:t>
+      </w:r>
+      <w:r>
+        <w:t xml:space="preserve"> </w:t>
+      </w:r>
+      <w:r>
+        <w:rPr>
+          <w:b/>
+          <w:bCs/>
+        </w:rPr>
+        <w:t xml:space="preserve">Type:</w:t>
+      </w:r>
+      <w:r>
+        <w:t xml:space="preserve"> </w:t>
+      </w:r>
+      <w:r>
+        <w:t xml:space="preserve">Task</w:t>
+      </w:r>
+      <w:r>
+        <w:t xml:space="preserve"> </w:t>
+      </w:r>
+      <w:r>
+        <w:rPr>
+          <w:b/>
+          <w:bCs/>
+        </w:rPr>
+        <w:t xml:space="preserve">Evidence:</w:t>
+      </w:r>
+      <w:r>
+        <w:t xml:space="preserve"> </w:t>
+      </w:r>
+      <w:r>
+        <w:t xml:space="preserve">docs/qa/hxc146_20260712T191000Z/EVIDENCE.md</w:t>
+      </w:r>
+      <w:r>
+        <w:t xml:space="preserve"> </w:t>
+      </w:r>
+      <w:r>
+        <w:rPr>
+          <w:b/>
+          <w:bCs/>
+        </w:rPr>
+        <w:t xml:space="preserve">Severity:</w:t>
+      </w:r>
+      <w:r>
+        <w:t xml:space="preserve"> </w:t>
+      </w:r>
+      <w:r>
+        <w:t xml:space="preserve">Medium</w:t>
+      </w:r>
+      <w:r>
+        <w:t xml:space="preserve"> </w:t>
+      </w:r>
+      <w:r>
+        <w:rPr>
+          <w:b/>
+          <w:bCs/>
+        </w:rPr>
+        <w:t xml:space="preserve">Created-By:</w:t>
+      </w:r>
+      <w:r>
+        <w:t xml:space="preserve"> </w:t>
+      </w:r>
+      <w:r>
+        <w:t xml:space="preserve">Claude</w:t>
+      </w:r>
+    </w:p>
+    <w:p>
+      <w:pPr>
+        <w:pStyle w:val="BodyText"/>
+      </w:pPr>
+      <w:r>
+        <w:t xml:space="preserve">The e2e challenge runner advertises multiple interface modes (cli, rest, tui, websocket) but none of them actually exercises the HelixCode server’s real HTTP API during a run, so the challenges validate the runner’s own logic rather than the shipped server endpoints. This is a documentation-versus-implementation gap that weakens the end-to-end proof. The work is to wire the challenge runner’s interfaces to genuinely call the running server’s HTTP API so the challenges prove the real user-facing endpoints work. Discovered 2026-07-12 real-infra retest. Evidence: docs/qa/infra_retest_20260712_hxc122_138/hxc138_challenge_report.json.</w:t>
+      </w:r>
+    </w:p>
     <w:bookmarkEnd w:id="164"/>
+    <w:bookmarkEnd w:id="165"/>
     <w:sectPr>
       <w:footnotePr>
         <w:numRestart w:val="eachSect"/>

</xml_diff>

<commit_message>
close(HXC-119): ACP Phase-5 permission mapping Option B (→ Implemented)
Source fbfffd7d. Closure Implemented (§11.4.33, Feature). Evidence docs/qa/hxc119_20260712T193000Z/.
Gates PASS. QUEUE: 0 — ALL IMPLEMENTABLE ITEMS COMPLETE.

Co-Authored-By: Claude Opus 4.8 <noreply@anthropic.com>
</commit_message>
<xml_diff>
--- a/docs/Fixed.docx
+++ b/docs/Fixed.docx
@@ -2,7 +2,7 @@
 <file path=word/document.xml><?xml version="1.0" encoding="utf-8"?>
 <w:document xmlns:w="http://schemas.openxmlformats.org/wordprocessingml/2006/main" xmlns:m="http://schemas.openxmlformats.org/officeDocument/2006/math" xmlns:r="http://schemas.openxmlformats.org/officeDocument/2006/relationships" xmlns:o="urn:schemas-microsoft-com:office:office" xmlns:v="urn:schemas-microsoft-com:vml" xmlns:w10="urn:schemas-microsoft-com:office:word" xmlns:a="http://schemas.openxmlformats.org/drawingml/2006/main" xmlns:pic="http://schemas.openxmlformats.org/drawingml/2006/picture" xmlns:wp="http://schemas.openxmlformats.org/drawingml/2006/wordprocessingDrawing">
   <w:body>
-    <w:bookmarkStart w:id="165" w:name="helixcode-fixed-items-tracker"/>
+    <w:bookmarkStart w:id="166" w:name="helixcode-fixed-items-tracker"/>
     <w:p>
       <w:pPr>
         <w:pStyle w:val="Heading1"/>
@@ -49922,7 +49922,107 @@
       </w:r>
     </w:p>
     <w:bookmarkEnd w:id="164"/>
+    <w:bookmarkStart w:id="165" w:name="X9a89ba240b8588079e28ad21b10e1a4675cc927"/>
+    <w:p>
+      <w:pPr>
+        <w:pStyle w:val="Heading2"/>
+      </w:pPr>
+      <w:r>
+        <w:t xml:space="preserve">HXC-119 — Agent Client Protocol (ACP) support is absent from the platform</w:t>
+      </w:r>
+    </w:p>
+    <w:p>
+      <w:pPr>
+        <w:pStyle w:val="FirstParagraph"/>
+      </w:pPr>
+      <w:r>
+        <w:rPr>
+          <w:b/>
+          <w:bCs/>
+        </w:rPr>
+        <w:t xml:space="preserve">Status:</w:t>
+      </w:r>
+      <w:r>
+        <w:t xml:space="preserve"> </w:t>
+      </w:r>
+      <w:r>
+        <w:t xml:space="preserve">Implemented (→ Fixed.md)</w:t>
+      </w:r>
+      <w:r>
+        <w:t xml:space="preserve"> </w:t>
+      </w:r>
+      <w:r>
+        <w:rPr>
+          <w:b/>
+          <w:bCs/>
+        </w:rPr>
+        <w:t xml:space="preserve">Type:</w:t>
+      </w:r>
+      <w:r>
+        <w:t xml:space="preserve"> </w:t>
+      </w:r>
+      <w:r>
+        <w:t xml:space="preserve">Feature</w:t>
+      </w:r>
+      <w:r>
+        <w:t xml:space="preserve"> </w:t>
+      </w:r>
+      <w:r>
+        <w:rPr>
+          <w:b/>
+          <w:bCs/>
+        </w:rPr>
+        <w:t xml:space="preserve">Evidence:</w:t>
+      </w:r>
+      <w:r>
+        <w:t xml:space="preserve"> </w:t>
+      </w:r>
+      <w:r>
+        <w:t xml:space="preserve">docs/qa/hxc119_20260712T193000Z/EVIDENCE.md</w:t>
+      </w:r>
+      <w:r>
+        <w:t xml:space="preserve"> </w:t>
+      </w:r>
+      <w:r>
+        <w:rPr>
+          <w:b/>
+          <w:bCs/>
+        </w:rPr>
+        <w:t xml:space="preserve">Severity:</w:t>
+      </w:r>
+      <w:r>
+        <w:t xml:space="preserve"> </w:t>
+      </w:r>
+      <w:r>
+        <w:t xml:space="preserve">High</w:t>
+      </w:r>
+      <w:r>
+        <w:t xml:space="preserve"> </w:t>
+      </w:r>
+      <w:r>
+        <w:rPr>
+          <w:b/>
+          <w:bCs/>
+        </w:rPr>
+        <w:t xml:space="preserve">Created-By:</w:t>
+      </w:r>
+      <w:r>
+        <w:t xml:space="preserve"> </w:t>
+      </w:r>
+      <w:r>
+        <w:t xml:space="preserve">Claude</w:t>
+      </w:r>
+    </w:p>
+    <w:p>
+      <w:pPr>
+        <w:pStyle w:val="BodyText"/>
+      </w:pPr>
+      <w:r>
+        <w:t xml:space="preserve">Governance rule CONST-040 lists the Agent Client Protocol among required capabilities, but there is no implementation of it anywhere in the codebase. Any user or integration expecting ACP connectivity currently cannot use it. The work is to design and implement real ACP support, or, if it proves structurally infeasible, to document that with cited evidence. The platform will then either genuinely support ACP or hold an honest, evidenced position instead of an unmet claim.</w:t>
+      </w:r>
+    </w:p>
     <w:bookmarkEnd w:id="165"/>
+    <w:bookmarkEnd w:id="166"/>
     <w:sectPr>
       <w:footnotePr>
         <w:numRestart w:val="eachSect"/>

</xml_diff>